<commit_message>
modifiche selezione_campione.json e procedura_migrazione
</commit_message>
<xml_diff>
--- a/docs/ProceduraDiMigrazione/Procedura_migrazione_20200514.docx
+++ b/docs/ProceduraDiMigrazione/Procedura_migrazione_20200514.docx
@@ -685,10 +685,26 @@
         <w:t xml:space="preserve">DB1: </w:t>
       </w:r>
       <w:r>
-        <w:t xml:space="preserve">Database di produzione 1 (cnx su Server OVH): contenente </w:t>
-      </w:r>
-      <w:r>
-        <w:t xml:space="preserve">le relative tabelle, sequenze, funzioni e view denominate rispettivamente </w:t>
+        <w:t>Database di produzione 1 (</w:t>
+      </w:r>
+      <w:proofErr w:type="spellStart"/>
+      <w:r>
+        <w:t>cnx</w:t>
+      </w:r>
+      <w:proofErr w:type="spellEnd"/>
+      <w:r>
+        <w:t xml:space="preserve"> su Server OVH): contenente </w:t>
+      </w:r>
+      <w:r>
+        <w:t xml:space="preserve">le relative tabelle, sequenze, funzioni e </w:t>
+      </w:r>
+      <w:proofErr w:type="spellStart"/>
+      <w:r>
+        <w:t>view</w:t>
+      </w:r>
+      <w:proofErr w:type="spellEnd"/>
+      <w:r>
+        <w:t xml:space="preserve"> denominate rispettivamente </w:t>
       </w:r>
       <w:r>
         <w:t xml:space="preserve">tabelle1, </w:t>
@@ -718,7 +734,15 @@
         <w:t xml:space="preserve">DB2: </w:t>
       </w:r>
       <w:r>
-        <w:t>Database di test 2 (Gorico su Server AWS)</w:t>
+        <w:t>Database di test 2 (</w:t>
+      </w:r>
+      <w:proofErr w:type="spellStart"/>
+      <w:r>
+        <w:t>Gorico</w:t>
+      </w:r>
+      <w:proofErr w:type="spellEnd"/>
+      <w:r>
+        <w:t xml:space="preserve"> su Server AWS)</w:t>
       </w:r>
       <w:r>
         <w:t>:</w:t>
@@ -727,7 +751,15 @@
         <w:t xml:space="preserve"> contenente </w:t>
       </w:r>
       <w:r>
-        <w:t>le relative tabelle, sequenze, funzioni e view denominate rispettivamente</w:t>
+        <w:t xml:space="preserve">le relative tabelle, sequenze, funzioni e </w:t>
+      </w:r>
+      <w:proofErr w:type="spellStart"/>
+      <w:r>
+        <w:t>view</w:t>
+      </w:r>
+      <w:proofErr w:type="spellEnd"/>
+      <w:r>
+        <w:t xml:space="preserve"> denominate rispettivamente</w:t>
       </w:r>
       <w:r>
         <w:t xml:space="preserve"> tabelle2, funzioni2, sequenze2 e view</w:t>
@@ -751,7 +783,15 @@
         <w:t>DB3</w:t>
       </w:r>
       <w:r>
-        <w:t xml:space="preserve"> (GoricoProd)</w:t>
+        <w:t xml:space="preserve"> (</w:t>
+      </w:r>
+      <w:proofErr w:type="spellStart"/>
+      <w:r>
+        <w:t>GoricoProd</w:t>
+      </w:r>
+      <w:proofErr w:type="spellEnd"/>
+      <w:r>
+        <w:t>)</w:t>
       </w:r>
       <w:r>
         <w:t>: futuro database di produzione.</w:t>
@@ -803,8 +843,13 @@
         <w:t>(tabelle1) e l’uni</w:t>
       </w:r>
       <w:r>
-        <w:t>one delle funzioni e delle view</w:t>
-      </w:r>
+        <w:t xml:space="preserve">one delle funzioni e delle </w:t>
+      </w:r>
+      <w:proofErr w:type="spellStart"/>
+      <w:r>
+        <w:t>view</w:t>
+      </w:r>
+      <w:proofErr w:type="spellEnd"/>
       <w:r>
         <w:t xml:space="preserve"> del database di produzione e di quello di test (funzioni1 U funzioni2 e views1 U views2).</w:t>
       </w:r>
@@ -834,22 +879,89 @@
           <w:szCs w:val="24"/>
         </w:rPr>
         <w:lastRenderedPageBreak/>
-        <w:t>Fare il dump del db in produzione o scaricarlo tramite filezilla</w:t>
-      </w:r>
-    </w:p>
-    <w:p>
-      <w:pPr>
-        <w:rPr>
-          <w:sz w:val="24"/>
-          <w:szCs w:val="24"/>
-        </w:rPr>
-      </w:pPr>
-      <w:r>
-        <w:rPr>
-          <w:sz w:val="24"/>
-          <w:szCs w:val="24"/>
-        </w:rPr>
-        <w:t xml:space="preserve">Il DB di produzione in Connexio è salvato </w:t>
+        <w:t xml:space="preserve">Fare il </w:t>
+      </w:r>
+      <w:proofErr w:type="spellStart"/>
+      <w:r>
+        <w:rPr>
+          <w:b/>
+          <w:bCs/>
+          <w:sz w:val="24"/>
+          <w:szCs w:val="24"/>
+        </w:rPr>
+        <w:t>dump</w:t>
+      </w:r>
+      <w:proofErr w:type="spellEnd"/>
+      <w:r>
+        <w:rPr>
+          <w:b/>
+          <w:bCs/>
+          <w:sz w:val="24"/>
+          <w:szCs w:val="24"/>
+        </w:rPr>
+        <w:t xml:space="preserve"> del </w:t>
+      </w:r>
+      <w:proofErr w:type="spellStart"/>
+      <w:r>
+        <w:rPr>
+          <w:b/>
+          <w:bCs/>
+          <w:sz w:val="24"/>
+          <w:szCs w:val="24"/>
+        </w:rPr>
+        <w:t>db</w:t>
+      </w:r>
+      <w:proofErr w:type="spellEnd"/>
+      <w:r>
+        <w:rPr>
+          <w:b/>
+          <w:bCs/>
+          <w:sz w:val="24"/>
+          <w:szCs w:val="24"/>
+        </w:rPr>
+        <w:t xml:space="preserve"> in produzione o scaricarlo tramite </w:t>
+      </w:r>
+      <w:proofErr w:type="spellStart"/>
+      <w:r>
+        <w:rPr>
+          <w:b/>
+          <w:bCs/>
+          <w:sz w:val="24"/>
+          <w:szCs w:val="24"/>
+        </w:rPr>
+        <w:t>filezilla</w:t>
+      </w:r>
+      <w:proofErr w:type="spellEnd"/>
+    </w:p>
+    <w:p>
+      <w:pPr>
+        <w:rPr>
+          <w:sz w:val="24"/>
+          <w:szCs w:val="24"/>
+        </w:rPr>
+      </w:pPr>
+      <w:r>
+        <w:rPr>
+          <w:sz w:val="24"/>
+          <w:szCs w:val="24"/>
+        </w:rPr>
+        <w:t xml:space="preserve">Il DB di produzione in </w:t>
+      </w:r>
+      <w:proofErr w:type="spellStart"/>
+      <w:r>
+        <w:rPr>
+          <w:sz w:val="24"/>
+          <w:szCs w:val="24"/>
+        </w:rPr>
+        <w:t>Connexio</w:t>
+      </w:r>
+      <w:proofErr w:type="spellEnd"/>
+      <w:r>
+        <w:rPr>
+          <w:sz w:val="24"/>
+          <w:szCs w:val="24"/>
+        </w:rPr>
+        <w:t xml:space="preserve"> è salvato </w:t>
       </w:r>
       <w:r>
         <w:rPr>
@@ -870,8 +982,49 @@
           <w:sz w:val="24"/>
           <w:szCs w:val="24"/>
         </w:rPr>
-        <w:t>/var/lib/postgresql</w:t>
-      </w:r>
+        <w:t>/</w:t>
+      </w:r>
+      <w:proofErr w:type="spellStart"/>
+      <w:r>
+        <w:rPr>
+          <w:sz w:val="24"/>
+          <w:szCs w:val="24"/>
+        </w:rPr>
+        <w:t>var</w:t>
+      </w:r>
+      <w:proofErr w:type="spellEnd"/>
+      <w:r>
+        <w:rPr>
+          <w:sz w:val="24"/>
+          <w:szCs w:val="24"/>
+        </w:rPr>
+        <w:t>/</w:t>
+      </w:r>
+      <w:proofErr w:type="spellStart"/>
+      <w:r>
+        <w:rPr>
+          <w:sz w:val="24"/>
+          <w:szCs w:val="24"/>
+        </w:rPr>
+        <w:t>lib</w:t>
+      </w:r>
+      <w:proofErr w:type="spellEnd"/>
+      <w:r>
+        <w:rPr>
+          <w:sz w:val="24"/>
+          <w:szCs w:val="24"/>
+        </w:rPr>
+        <w:t>/</w:t>
+      </w:r>
+      <w:proofErr w:type="spellStart"/>
+      <w:r>
+        <w:rPr>
+          <w:sz w:val="24"/>
+          <w:szCs w:val="24"/>
+        </w:rPr>
+        <w:t>postgresql</w:t>
+      </w:r>
+      <w:proofErr w:type="spellEnd"/>
       <w:r>
         <w:rPr>
           <w:sz w:val="24"/>
@@ -884,7 +1037,39 @@
           <w:sz w:val="24"/>
           <w:szCs w:val="24"/>
         </w:rPr>
-        <w:t xml:space="preserve">: è possibile scaricarlo tramite FileZilla. Qualora un backup aggiornato non sia presente è necessario lanciare un backup_manualmente. </w:t>
+        <w:t xml:space="preserve">: è possibile scaricarlo tramite </w:t>
+      </w:r>
+      <w:proofErr w:type="spellStart"/>
+      <w:r>
+        <w:rPr>
+          <w:sz w:val="24"/>
+          <w:szCs w:val="24"/>
+        </w:rPr>
+        <w:t>FileZilla</w:t>
+      </w:r>
+      <w:proofErr w:type="spellEnd"/>
+      <w:r>
+        <w:rPr>
+          <w:sz w:val="24"/>
+          <w:szCs w:val="24"/>
+        </w:rPr>
+        <w:t xml:space="preserve">. Qualora un backup aggiornato non sia presente è necessario lanciare un </w:t>
+      </w:r>
+      <w:proofErr w:type="spellStart"/>
+      <w:r>
+        <w:rPr>
+          <w:sz w:val="24"/>
+          <w:szCs w:val="24"/>
+        </w:rPr>
+        <w:t>backup_manualmente</w:t>
+      </w:r>
+      <w:proofErr w:type="spellEnd"/>
+      <w:r>
+        <w:rPr>
+          <w:sz w:val="24"/>
+          <w:szCs w:val="24"/>
+        </w:rPr>
+        <w:t xml:space="preserve">. </w:t>
       </w:r>
     </w:p>
     <w:p>
@@ -914,22 +1099,46 @@
           <w:sz w:val="24"/>
           <w:szCs w:val="24"/>
         </w:rPr>
-        <w:t>Prima di lanciare il back-up verificare la presenza di sufficiente spazio su disco tramite il comando “df -h”</w:t>
-      </w:r>
-    </w:p>
-    <w:p>
-      <w:pPr>
-        <w:rPr>
-          <w:sz w:val="24"/>
-          <w:szCs w:val="24"/>
-        </w:rPr>
-      </w:pPr>
-      <w:r>
-        <w:rPr>
-          <w:sz w:val="24"/>
-          <w:szCs w:val="24"/>
-        </w:rPr>
-        <w:t>Per lanciare il Bac</w:t>
+        <w:t>Prima di lanciare il back-up verificare la presenza di sufficiente spazio su disco tramite il comando “</w:t>
+      </w:r>
+      <w:proofErr w:type="spellStart"/>
+      <w:r>
+        <w:rPr>
+          <w:sz w:val="24"/>
+          <w:szCs w:val="24"/>
+        </w:rPr>
+        <w:t>df</w:t>
+      </w:r>
+      <w:proofErr w:type="spellEnd"/>
+      <w:r>
+        <w:rPr>
+          <w:sz w:val="24"/>
+          <w:szCs w:val="24"/>
+        </w:rPr>
+        <w:t xml:space="preserve"> -h”</w:t>
+      </w:r>
+    </w:p>
+    <w:p>
+      <w:pPr>
+        <w:rPr>
+          <w:sz w:val="24"/>
+          <w:szCs w:val="24"/>
+        </w:rPr>
+      </w:pPr>
+      <w:r>
+        <w:rPr>
+          <w:sz w:val="24"/>
+          <w:szCs w:val="24"/>
+        </w:rPr>
+        <w:t xml:space="preserve">Per lanciare il </w:t>
+      </w:r>
+      <w:proofErr w:type="spellStart"/>
+      <w:r>
+        <w:rPr>
+          <w:sz w:val="24"/>
+          <w:szCs w:val="24"/>
+        </w:rPr>
+        <w:t>Bac</w:t>
       </w:r>
       <w:r>
         <w:rPr>
@@ -943,7 +1152,15 @@
           <w:sz w:val="24"/>
           <w:szCs w:val="24"/>
         </w:rPr>
-        <w:t>up utilizzare la seguente riga di comando:</w:t>
+        <w:t>up</w:t>
+      </w:r>
+      <w:proofErr w:type="spellEnd"/>
+      <w:r>
+        <w:rPr>
+          <w:sz w:val="24"/>
+          <w:szCs w:val="24"/>
+        </w:rPr>
+        <w:t xml:space="preserve"> utilizzare la seguente riga di comando:</w:t>
       </w:r>
     </w:p>
     <w:p>
@@ -954,13 +1171,59 @@
           <w:lang w:val="en-GB"/>
         </w:rPr>
       </w:pPr>
+      <w:proofErr w:type="spellStart"/>
       <w:r>
         <w:rPr>
           <w:sz w:val="24"/>
           <w:szCs w:val="24"/>
           <w:lang w:val="en-GB"/>
         </w:rPr>
-        <w:t>pg_dump --file "/home/alacritas0/20200305_manuale.backup" --host "127.0.0.1" --port "5432" --username "entrasp" --verbose --format=c --blobs "cnx"</w:t>
+        <w:t>pg_dump</w:t>
+      </w:r>
+      <w:proofErr w:type="spellEnd"/>
+      <w:r>
+        <w:rPr>
+          <w:sz w:val="24"/>
+          <w:szCs w:val="24"/>
+          <w:lang w:val="en-GB"/>
+        </w:rPr>
+        <w:t xml:space="preserve"> --file "/home/alacritas0/20200305_manuale.backup" --host "127.0.0.1" --port "5432" --username "</w:t>
+      </w:r>
+      <w:proofErr w:type="spellStart"/>
+      <w:r>
+        <w:rPr>
+          <w:sz w:val="24"/>
+          <w:szCs w:val="24"/>
+          <w:lang w:val="en-GB"/>
+        </w:rPr>
+        <w:t>entrasp</w:t>
+      </w:r>
+      <w:proofErr w:type="spellEnd"/>
+      <w:r>
+        <w:rPr>
+          <w:sz w:val="24"/>
+          <w:szCs w:val="24"/>
+          <w:lang w:val="en-GB"/>
+        </w:rPr>
+        <w:t>" --verbose --format=c --blobs "</w:t>
+      </w:r>
+      <w:proofErr w:type="spellStart"/>
+      <w:r>
+        <w:rPr>
+          <w:sz w:val="24"/>
+          <w:szCs w:val="24"/>
+          <w:lang w:val="en-GB"/>
+        </w:rPr>
+        <w:t>cnx</w:t>
+      </w:r>
+      <w:proofErr w:type="spellEnd"/>
+      <w:r>
+        <w:rPr>
+          <w:sz w:val="24"/>
+          <w:szCs w:val="24"/>
+          <w:lang w:val="en-GB"/>
+        </w:rPr>
+        <w:t>"</w:t>
       </w:r>
     </w:p>
     <w:p>
@@ -1004,8 +1267,19 @@
           <w:sz w:val="24"/>
           <w:szCs w:val="24"/>
         </w:rPr>
-        <w:t>Caricare su AWS il DB cnx</w:t>
-      </w:r>
+        <w:t xml:space="preserve">Caricare su AWS il DB </w:t>
+      </w:r>
+      <w:proofErr w:type="spellStart"/>
+      <w:r>
+        <w:rPr>
+          <w:b/>
+          <w:bCs/>
+          <w:sz w:val="24"/>
+          <w:szCs w:val="24"/>
+        </w:rPr>
+        <w:t>cnx</w:t>
+      </w:r>
+      <w:proofErr w:type="spellEnd"/>
     </w:p>
     <w:p>
       <w:pPr>
@@ -1019,10 +1293,34 @@
         <w:t xml:space="preserve">[FATTO DA AMEDEO] </w:t>
       </w:r>
       <w:r>
-        <w:t>Caricare su AWS il DB cnx backup di DB1</w:t>
-      </w:r>
-      <w:r>
-        <w:t>: per farlo è necessario usare scp (da GIT Bash)</w:t>
+        <w:t xml:space="preserve">Caricare su AWS il DB </w:t>
+      </w:r>
+      <w:proofErr w:type="spellStart"/>
+      <w:r>
+        <w:t>cnx</w:t>
+      </w:r>
+      <w:proofErr w:type="spellEnd"/>
+      <w:r>
+        <w:t xml:space="preserve"> backup di DB1</w:t>
+      </w:r>
+      <w:r>
+        <w:t xml:space="preserve">: per farlo è necessario usare </w:t>
+      </w:r>
+      <w:proofErr w:type="spellStart"/>
+      <w:r>
+        <w:t>scp</w:t>
+      </w:r>
+      <w:proofErr w:type="spellEnd"/>
+      <w:r>
+        <w:t xml:space="preserve"> (da GIT </w:t>
+      </w:r>
+      <w:proofErr w:type="spellStart"/>
+      <w:r>
+        <w:t>Bash</w:t>
+      </w:r>
+      <w:proofErr w:type="spellEnd"/>
+      <w:r>
+        <w:t>)</w:t>
       </w:r>
       <w:r>
         <w:t>:</w:t>
@@ -1037,7 +1335,15 @@
         </w:numPr>
       </w:pPr>
       <w:r>
-        <w:t>Andare nella dir in cui c’è il db;</w:t>
+        <w:t xml:space="preserve">Andare nella dir in cui c’è il </w:t>
+      </w:r>
+      <w:proofErr w:type="spellStart"/>
+      <w:r>
+        <w:t>db</w:t>
+      </w:r>
+      <w:proofErr w:type="spellEnd"/>
+      <w:r>
+        <w:t>;</w:t>
       </w:r>
     </w:p>
     <w:p>
@@ -1052,7 +1358,23 @@
         <w:t>Scrivere il comando (opportunam</w:t>
       </w:r>
       <w:r>
-        <w:t>ente modificato in relazione al nome del db ed alla posizione della chiave di autenticazione (file .pem):</w:t>
+        <w:t xml:space="preserve">ente modificato in relazione al nome del </w:t>
+      </w:r>
+      <w:proofErr w:type="spellStart"/>
+      <w:r>
+        <w:t>db</w:t>
+      </w:r>
+      <w:proofErr w:type="spellEnd"/>
+      <w:r>
+        <w:t xml:space="preserve"> ed alla posizione della chiave di autenticazione (file .</w:t>
+      </w:r>
+      <w:proofErr w:type="spellStart"/>
+      <w:r>
+        <w:t>pem</w:t>
+      </w:r>
+      <w:proofErr w:type="spellEnd"/>
+      <w:r>
+        <w:t>):</w:t>
       </w:r>
     </w:p>
     <w:p>
@@ -1066,12 +1388,37 @@
           <w:lang w:val="en-GB"/>
         </w:rPr>
       </w:pPr>
+      <w:proofErr w:type="spellStart"/>
       <w:r>
         <w:rPr>
           <w:rFonts w:asciiTheme="majorHAnsi" w:hAnsiTheme="majorHAnsi" w:cstheme="majorHAnsi"/>
           <w:lang w:val="en-GB"/>
         </w:rPr>
-        <w:t xml:space="preserve">scp -i C:/Users/Amedeo/OneDrive/MigrazioneGRC_One_Drive/keys/server_amedeo.pem ./cnx_db_2020-02-16_00-03.backup </w:t>
+        <w:t>scp</w:t>
+      </w:r>
+      <w:proofErr w:type="spellEnd"/>
+      <w:r>
+        <w:rPr>
+          <w:rFonts w:asciiTheme="majorHAnsi" w:hAnsiTheme="majorHAnsi" w:cstheme="majorHAnsi"/>
+          <w:lang w:val="en-GB"/>
+        </w:rPr>
+        <w:t xml:space="preserve"> -</w:t>
+      </w:r>
+      <w:proofErr w:type="spellStart"/>
+      <w:r>
+        <w:rPr>
+          <w:rFonts w:asciiTheme="majorHAnsi" w:hAnsiTheme="majorHAnsi" w:cstheme="majorHAnsi"/>
+          <w:lang w:val="en-GB"/>
+        </w:rPr>
+        <w:t>i</w:t>
+      </w:r>
+      <w:proofErr w:type="spellEnd"/>
+      <w:r>
+        <w:rPr>
+          <w:rFonts w:asciiTheme="majorHAnsi" w:hAnsiTheme="majorHAnsi" w:cstheme="majorHAnsi"/>
+          <w:lang w:val="en-GB"/>
+        </w:rPr>
+        <w:t xml:space="preserve"> C:/Users/Amedeo/OneDrive/MigrazioneGRC_One_Drive/keys/server_amedeo.pem ./cnx_db_2020-02-16_00-03.backup </w:t>
       </w:r>
       <w:hyperlink r:id="rId6" w:history="1">
         <w:r>
@@ -1110,7 +1457,21 @@
         <w:rPr>
           <w:rFonts w:asciiTheme="majorHAnsi" w:hAnsiTheme="majorHAnsi" w:cstheme="majorHAnsi"/>
         </w:rPr>
-        <w:t xml:space="preserve"> il file pem adesso è nel desktop.</w:t>
+        <w:t xml:space="preserve"> il file </w:t>
+      </w:r>
+      <w:proofErr w:type="spellStart"/>
+      <w:r>
+        <w:rPr>
+          <w:rFonts w:asciiTheme="majorHAnsi" w:hAnsiTheme="majorHAnsi" w:cstheme="majorHAnsi"/>
+        </w:rPr>
+        <w:t>pem</w:t>
+      </w:r>
+      <w:proofErr w:type="spellEnd"/>
+      <w:r>
+        <w:rPr>
+          <w:rFonts w:asciiTheme="majorHAnsi" w:hAnsiTheme="majorHAnsi" w:cstheme="majorHAnsi"/>
+        </w:rPr>
+        <w:t xml:space="preserve"> adesso è nel desktop.</w:t>
       </w:r>
     </w:p>
     <w:p>
@@ -1124,12 +1485,37 @@
           <w:lang w:val="en-GB"/>
         </w:rPr>
       </w:pPr>
+      <w:proofErr w:type="spellStart"/>
       <w:r>
         <w:rPr>
           <w:rFonts w:asciiTheme="majorHAnsi" w:hAnsiTheme="majorHAnsi" w:cstheme="majorHAnsi"/>
           <w:lang w:val="en-GB"/>
         </w:rPr>
-        <w:t>scp -i C:/Users/Amedeo/Desktop/server_amedeo.pem ./2020514_manuale.backup ec2-user@18.197.167.37:/home/ec2-user/</w:t>
+        <w:t>scp</w:t>
+      </w:r>
+      <w:proofErr w:type="spellEnd"/>
+      <w:r>
+        <w:rPr>
+          <w:rFonts w:asciiTheme="majorHAnsi" w:hAnsiTheme="majorHAnsi" w:cstheme="majorHAnsi"/>
+          <w:lang w:val="en-GB"/>
+        </w:rPr>
+        <w:t xml:space="preserve"> -</w:t>
+      </w:r>
+      <w:proofErr w:type="spellStart"/>
+      <w:r>
+        <w:rPr>
+          <w:rFonts w:asciiTheme="majorHAnsi" w:hAnsiTheme="majorHAnsi" w:cstheme="majorHAnsi"/>
+          <w:lang w:val="en-GB"/>
+        </w:rPr>
+        <w:t>i</w:t>
+      </w:r>
+      <w:proofErr w:type="spellEnd"/>
+      <w:r>
+        <w:rPr>
+          <w:rFonts w:asciiTheme="majorHAnsi" w:hAnsiTheme="majorHAnsi" w:cstheme="majorHAnsi"/>
+          <w:lang w:val="en-GB"/>
+        </w:rPr>
+        <w:t xml:space="preserve"> C:/Users/Amedeo/Desktop/server_amedeo.pem ./2020514_manuale.backup ec2-user@18.197.167.37:/home/ec2-user/</w:t>
       </w:r>
     </w:p>
     <w:p>
@@ -1144,10 +1530,31 @@
         <w:t xml:space="preserve">[FATTO DA AMEDEO] </w:t>
       </w:r>
       <w:r>
-        <w:t>Caricare istanza del db tramite comando dalla shell di ssh</w:t>
-      </w:r>
-      <w:r>
-        <w:t xml:space="preserve"> (da putty quando ti connetti su AWS)</w:t>
+        <w:t xml:space="preserve">Caricare istanza del </w:t>
+      </w:r>
+      <w:proofErr w:type="spellStart"/>
+      <w:r>
+        <w:t>db</w:t>
+      </w:r>
+      <w:proofErr w:type="spellEnd"/>
+      <w:r>
+        <w:t xml:space="preserve"> tramite comando dalla shell di </w:t>
+      </w:r>
+      <w:proofErr w:type="spellStart"/>
+      <w:r>
+        <w:t>ssh</w:t>
+      </w:r>
+      <w:proofErr w:type="spellEnd"/>
+      <w:r>
+        <w:t xml:space="preserve"> (da </w:t>
+      </w:r>
+      <w:proofErr w:type="spellStart"/>
+      <w:r>
+        <w:t>putty</w:t>
+      </w:r>
+      <w:proofErr w:type="spellEnd"/>
+      <w:r>
+        <w:t xml:space="preserve"> quando ti connetti su AWS)</w:t>
       </w:r>
       <w:r>
         <w:t>:</w:t>
@@ -1158,12 +1565,30 @@
         <w:pStyle w:val="Paragrafoelenco"/>
         <w:ind w:left="360"/>
       </w:pPr>
-      <w:r>
-        <w:t>pg_restore -v -h goricotest-new.caxbbckt9xen.eu-central-1.rds.amazonaws.com -U postgres -d Gorico</w:t>
+      <w:proofErr w:type="spellStart"/>
+      <w:r>
+        <w:t>pg_restore</w:t>
+      </w:r>
+      <w:proofErr w:type="spellEnd"/>
+      <w:r>
+        <w:t xml:space="preserve"> -v -h goricotest-new.caxbbckt9xen.eu-central-1.rds.amazonaws.com -U </w:t>
+      </w:r>
+      <w:proofErr w:type="spellStart"/>
+      <w:r>
+        <w:t>postgres</w:t>
+      </w:r>
+      <w:proofErr w:type="spellEnd"/>
+      <w:r>
+        <w:t xml:space="preserve"> -d </w:t>
+      </w:r>
+      <w:proofErr w:type="spellStart"/>
+      <w:r>
+        <w:t>Gorico</w:t>
       </w:r>
       <w:r>
         <w:t>Prod</w:t>
       </w:r>
+      <w:proofErr w:type="spellEnd"/>
       <w:r>
         <w:t xml:space="preserve"> Backup20190902</w:t>
       </w:r>
@@ -1179,9 +1604,27 @@
         <w:pStyle w:val="Paragrafoelenco"/>
         <w:ind w:left="360"/>
       </w:pPr>
-      <w:r>
-        <w:t>GoricoProd è il db fatto in precedenza su pgAdmin</w:t>
-      </w:r>
+      <w:proofErr w:type="spellStart"/>
+      <w:r>
+        <w:t>GoricoProd</w:t>
+      </w:r>
+      <w:proofErr w:type="spellEnd"/>
+      <w:r>
+        <w:t xml:space="preserve"> è il </w:t>
+      </w:r>
+      <w:proofErr w:type="spellStart"/>
+      <w:r>
+        <w:t>db</w:t>
+      </w:r>
+      <w:proofErr w:type="spellEnd"/>
+      <w:r>
+        <w:t xml:space="preserve"> fatto in precedenza su </w:t>
+      </w:r>
+      <w:proofErr w:type="spellStart"/>
+      <w:r>
+        <w:t>pgAdmin</w:t>
+      </w:r>
+      <w:proofErr w:type="spellEnd"/>
     </w:p>
     <w:p>
       <w:pPr>
@@ -1189,7 +1632,15 @@
         <w:ind w:left="360"/>
       </w:pPr>
       <w:r>
-        <w:t xml:space="preserve">Backup20190902 è il nome del db (il 14-05-2020 noi avevamo </w:t>
+        <w:t xml:space="preserve">Backup20190902 è il nome del </w:t>
+      </w:r>
+      <w:proofErr w:type="spellStart"/>
+      <w:r>
+        <w:t>db</w:t>
+      </w:r>
+      <w:proofErr w:type="spellEnd"/>
+      <w:r>
+        <w:t xml:space="preserve"> (il 14-05-2020 noi avevamo </w:t>
       </w:r>
       <w:r>
         <w:rPr>
@@ -1201,7 +1652,21 @@
         <w:rPr>
           <w:rFonts w:asciiTheme="majorHAnsi" w:hAnsiTheme="majorHAnsi" w:cstheme="majorHAnsi"/>
         </w:rPr>
-        <w:t xml:space="preserve"> come nome. Se non lo trova mandare il comando ls per vedere cosa c’è dentro</w:t>
+        <w:t xml:space="preserve"> come nome. Se non lo trova mandare il comando </w:t>
+      </w:r>
+      <w:proofErr w:type="spellStart"/>
+      <w:r>
+        <w:rPr>
+          <w:rFonts w:asciiTheme="majorHAnsi" w:hAnsiTheme="majorHAnsi" w:cstheme="majorHAnsi"/>
+        </w:rPr>
+        <w:t>ls</w:t>
+      </w:r>
+      <w:proofErr w:type="spellEnd"/>
+      <w:r>
+        <w:rPr>
+          <w:rFonts w:asciiTheme="majorHAnsi" w:hAnsiTheme="majorHAnsi" w:cstheme="majorHAnsi"/>
+        </w:rPr>
+        <w:t xml:space="preserve"> per vedere cosa c’è dentro</w:t>
       </w:r>
       <w:r>
         <w:t xml:space="preserve">) </w:t>
@@ -1301,7 +1766,23 @@
         <w:t xml:space="preserve">[FATTO DA SILVIO] </w:t>
       </w:r>
       <w:r>
-        <w:t>Copiare la view “grc_lista_funzioni” su DB3 per ottenere una lista delle funzioni presenti in DB3.</w:t>
+        <w:t xml:space="preserve">Copiare la </w:t>
+      </w:r>
+      <w:proofErr w:type="spellStart"/>
+      <w:r>
+        <w:t>view</w:t>
+      </w:r>
+      <w:proofErr w:type="spellEnd"/>
+      <w:r>
+        <w:t xml:space="preserve"> “</w:t>
+      </w:r>
+      <w:proofErr w:type="spellStart"/>
+      <w:r>
+        <w:t>grc_lista_funzioni</w:t>
+      </w:r>
+      <w:proofErr w:type="spellEnd"/>
+      <w:r>
+        <w:t>” su DB3 per ottenere una lista delle funzioni presenti in DB3.</w:t>
       </w:r>
     </w:p>
     <w:p>
@@ -1322,20 +1803,65 @@
         <w:t xml:space="preserve">[FATTO DA SILVIO] </w:t>
       </w:r>
       <w:r>
-        <w:t>Usare la view grc_lista_funzioni</w:t>
-      </w:r>
-      <w:r>
-        <w:t xml:space="preserve"> su pgAdmin </w:t>
+        <w:t xml:space="preserve">Usare la </w:t>
+      </w:r>
+      <w:proofErr w:type="spellStart"/>
+      <w:r>
+        <w:t>view</w:t>
+      </w:r>
+      <w:proofErr w:type="spellEnd"/>
+      <w:r>
+        <w:t xml:space="preserve"> </w:t>
+      </w:r>
+      <w:proofErr w:type="spellStart"/>
+      <w:r>
+        <w:t>grc_lista_funzioni</w:t>
+      </w:r>
+      <w:proofErr w:type="spellEnd"/>
+      <w:r>
+        <w:t xml:space="preserve"> su </w:t>
+      </w:r>
+      <w:proofErr w:type="spellStart"/>
+      <w:r>
+        <w:t>pgAdmin</w:t>
+      </w:r>
+      <w:proofErr w:type="spellEnd"/>
+      <w:r>
+        <w:t xml:space="preserve"> </w:t>
       </w:r>
       <w:r>
         <w:t>per ottenere una lista delle funzioni presenti nel database2.</w:t>
       </w:r>
       <w:r>
-        <w:t xml:space="preserve"> Tale view restituisce una colonna con tutti i nomi delle funzioni all’interno del DB2. Copiare tale colonna e incollarla nel file excel: </w:t>
+        <w:t xml:space="preserve"> Tale </w:t>
+      </w:r>
+      <w:proofErr w:type="spellStart"/>
+      <w:r>
+        <w:t>view</w:t>
+      </w:r>
+      <w:proofErr w:type="spellEnd"/>
+      <w:r>
+        <w:t xml:space="preserve"> restituisce una colonna con tutti i nomi delle funzioni all’interno del DB2. Copiare tale colonna e incollarla nel file </w:t>
+      </w:r>
+      <w:proofErr w:type="spellStart"/>
+      <w:r>
+        <w:t>excel</w:t>
+      </w:r>
+      <w:proofErr w:type="spellEnd"/>
+      <w:r>
+        <w:t xml:space="preserve">: </w:t>
       </w:r>
       <w:r>
         <w:lastRenderedPageBreak/>
-        <w:t xml:space="preserve">“funzioni_e_view_gorico_goricoprod”, foglio 1 </w:t>
+        <w:t>“</w:t>
+      </w:r>
+      <w:proofErr w:type="spellStart"/>
+      <w:r>
+        <w:t>funzioni_e_view_gorico_goricoprod</w:t>
+      </w:r>
+      <w:proofErr w:type="spellEnd"/>
+      <w:r>
+        <w:t xml:space="preserve">”, foglio 1 </w:t>
       </w:r>
       <w:r>
         <w:rPr>
@@ -1347,7 +1873,21 @@
         <w:rPr>
           <w:strike/>
         </w:rPr>
-        <w:t xml:space="preserve"> “funzioni_gorico_goricoprod”, primo capitolo “</w:t>
+        <w:t xml:space="preserve"> “</w:t>
+      </w:r>
+      <w:proofErr w:type="spellStart"/>
+      <w:r>
+        <w:rPr>
+          <w:strike/>
+        </w:rPr>
+        <w:t>funzioni_gorico_goricoprod</w:t>
+      </w:r>
+      <w:proofErr w:type="spellEnd"/>
+      <w:r>
+        <w:rPr>
+          <w:strike/>
+        </w:rPr>
+        <w:t>”, primo capitolo “</w:t>
       </w:r>
       <w:r>
         <w:rPr>
@@ -1377,22 +1917,76 @@
         <w:t xml:space="preserve">[FATTO DA SILVIO] </w:t>
       </w:r>
       <w:r>
-        <w:t>Usare la view grc_lista_funzioni per ottenere una lista delle funzioni presenti nel database3.</w:t>
-      </w:r>
+        <w:t xml:space="preserve">Usare la </w:t>
+      </w:r>
+      <w:proofErr w:type="spellStart"/>
+      <w:r>
+        <w:t>view</w:t>
+      </w:r>
+      <w:proofErr w:type="spellEnd"/>
       <w:r>
         <w:t xml:space="preserve"> </w:t>
       </w:r>
-      <w:r>
-        <w:t>Tale view restituisce una colonna con tutti i nomi delle funzioni all’interno del DB3. Copiare tale colonna e incollarla nel file excel: “funzioni_e_view_gorico_goricoprod” foglio 1</w:t>
+      <w:proofErr w:type="spellStart"/>
+      <w:r>
+        <w:t>grc_lista_funzioni</w:t>
+      </w:r>
+      <w:proofErr w:type="spellEnd"/>
+      <w:r>
+        <w:t xml:space="preserve"> per ottenere una lista delle funzioni presenti nel database3.</w:t>
       </w:r>
       <w:r>
         <w:t xml:space="preserve"> </w:t>
       </w:r>
       <w:r>
+        <w:t xml:space="preserve">Tale </w:t>
+      </w:r>
+      <w:proofErr w:type="spellStart"/>
+      <w:r>
+        <w:t>view</w:t>
+      </w:r>
+      <w:proofErr w:type="spellEnd"/>
+      <w:r>
+        <w:t xml:space="preserve"> restituisce una colonna con tutti i nomi delle funzioni all’interno del DB3. Copiare tale colonna e incollarla nel file </w:t>
+      </w:r>
+      <w:proofErr w:type="spellStart"/>
+      <w:r>
+        <w:t>excel</w:t>
+      </w:r>
+      <w:proofErr w:type="spellEnd"/>
+      <w:r>
+        <w:t>: “</w:t>
+      </w:r>
+      <w:proofErr w:type="spellStart"/>
+      <w:r>
+        <w:t>funzioni_e_view_gorico_goricoprod</w:t>
+      </w:r>
+      <w:proofErr w:type="spellEnd"/>
+      <w:r>
+        <w:t>” foglio 1</w:t>
+      </w:r>
+      <w:r>
+        <w:t xml:space="preserve"> </w:t>
+      </w:r>
+      <w:r>
         <w:rPr>
           <w:strike/>
         </w:rPr>
-        <w:t>e nel file word “funzioni_gorico_goricoprod”, secondo capitolo “</w:t>
+        <w:t>e nel file word “</w:t>
+      </w:r>
+      <w:proofErr w:type="spellStart"/>
+      <w:r>
+        <w:rPr>
+          <w:strike/>
+        </w:rPr>
+        <w:t>funzioni_gorico_goricoprod</w:t>
+      </w:r>
+      <w:proofErr w:type="spellEnd"/>
+      <w:r>
+        <w:rPr>
+          <w:strike/>
+        </w:rPr>
+        <w:t>”, secondo capitolo “</w:t>
       </w:r>
       <w:r>
         <w:rPr>
@@ -1437,9 +2031,11 @@
       <w:r>
         <w:t xml:space="preserve"> utilizzando la funzione </w:t>
       </w:r>
+      <w:proofErr w:type="spellStart"/>
       <w:r>
         <w:t>cerca.vert</w:t>
       </w:r>
+      <w:proofErr w:type="spellEnd"/>
       <w:r>
         <w:t xml:space="preserve"> </w:t>
       </w:r>
@@ -1456,7 +2052,23 @@
         <w:t xml:space="preserve"> O COSE SIMILI</w:t>
       </w:r>
       <w:r>
-        <w:t xml:space="preserve"> nel file excel “funzioni_e_view_gorico_goricoprod” foglio 1</w:t>
+        <w:t xml:space="preserve"> nel file </w:t>
+      </w:r>
+      <w:proofErr w:type="spellStart"/>
+      <w:r>
+        <w:t>excel</w:t>
+      </w:r>
+      <w:proofErr w:type="spellEnd"/>
+      <w:r>
+        <w:t xml:space="preserve"> “</w:t>
+      </w:r>
+      <w:proofErr w:type="spellStart"/>
+      <w:r>
+        <w:t>funzioni_e_view_gorico_goricoprod</w:t>
+      </w:r>
+      <w:proofErr w:type="spellEnd"/>
+      <w:r>
+        <w:t>” foglio 1</w:t>
       </w:r>
       <w:r>
         <w:t>.</w:t>
@@ -1483,7 +2095,21 @@
         <w:rPr>
           <w:strike/>
         </w:rPr>
-        <w:t xml:space="preserve">Una volta ottenuta tale lista, scriverla nel file word “funzioni_gorico_goricoprod” </w:t>
+        <w:t>Una volta ottenuta tale lista, scriverla nel file word “</w:t>
+      </w:r>
+      <w:proofErr w:type="spellStart"/>
+      <w:r>
+        <w:rPr>
+          <w:strike/>
+        </w:rPr>
+        <w:t>funzioni_gorico_goricoprod</w:t>
+      </w:r>
+      <w:proofErr w:type="spellEnd"/>
+      <w:r>
+        <w:rPr>
+          <w:strike/>
+        </w:rPr>
+        <w:t xml:space="preserve">” </w:t>
       </w:r>
       <w:r>
         <w:rPr>
@@ -1532,7 +2158,31 @@
         <w:t>”.</w:t>
       </w:r>
       <w:r>
-        <w:t xml:space="preserve"> Inoltre, salvare tale colonna in un file excel a parte che può essere chiamato, ad esempio, “da_importare.csv”. Il file dev’essere salvato in formato csv con codifica UTF8 (scegliere nel menù a tendina quando salvi il dato”.</w:t>
+        <w:t xml:space="preserve"> Inoltre, salvare tale colonna in un file </w:t>
+      </w:r>
+      <w:proofErr w:type="spellStart"/>
+      <w:r>
+        <w:t>excel</w:t>
+      </w:r>
+      <w:proofErr w:type="spellEnd"/>
+      <w:r>
+        <w:t xml:space="preserve"> a parte che può essere chiamato, ad esempio, “da_importare.csv”. Il file dev’essere salvato in formato </w:t>
+      </w:r>
+      <w:proofErr w:type="spellStart"/>
+      <w:r>
+        <w:t>csv</w:t>
+      </w:r>
+      <w:proofErr w:type="spellEnd"/>
+      <w:r>
+        <w:t xml:space="preserve"> con codifica UTF8 (scegliere nel </w:t>
+      </w:r>
+      <w:proofErr w:type="spellStart"/>
+      <w:r>
+        <w:t>menù</w:t>
+      </w:r>
+      <w:proofErr w:type="spellEnd"/>
+      <w:r>
+        <w:t xml:space="preserve"> a tendina quando salvi il dato”.</w:t>
       </w:r>
     </w:p>
     <w:p>
@@ -1551,7 +2201,15 @@
         <w:t xml:space="preserve">[FATTO DA SILVIO] </w:t>
       </w:r>
       <w:r>
-        <w:t>Copiare da DB2 l’SQL della tabella “funzioni_da_importare” in DB3 per creare la tabella. Riempire la suddetta tabella: tasto destro</w:t>
+        <w:t>Copiare da DB2 l’SQL della tabella “</w:t>
+      </w:r>
+      <w:proofErr w:type="spellStart"/>
+      <w:r>
+        <w:t>funzioni_da_importare</w:t>
+      </w:r>
+      <w:proofErr w:type="spellEnd"/>
+      <w:r>
+        <w:t>” in DB3 per creare la tabella. Riempire la suddetta tabella: tasto destro</w:t>
       </w:r>
       <w:r>
         <w:sym w:font="Wingdings" w:char="F0E0"/>
@@ -1575,16 +2233,61 @@
         <w:sym w:font="Wingdings" w:char="F0E0"/>
       </w:r>
       <w:r>
-        <w:t xml:space="preserve"> selezionare il file csv “da_importare.csv” appena salvato (dev’essere chiuso per poter eseguire la procedura, altrimenti pgadmin ti dà permesso negato”)</w:t>
+        <w:t xml:space="preserve"> selezionare il file </w:t>
+      </w:r>
+      <w:proofErr w:type="spellStart"/>
+      <w:r>
+        <w:t>csv</w:t>
+      </w:r>
+      <w:proofErr w:type="spellEnd"/>
+      <w:r>
+        <w:t xml:space="preserve"> “da_importare.csv” appena salvato (dev’essere chiuso per poter eseguire la procedura, altrimenti </w:t>
+      </w:r>
+      <w:proofErr w:type="spellStart"/>
+      <w:r>
+        <w:t>pgadmin</w:t>
+      </w:r>
+      <w:proofErr w:type="spellEnd"/>
+      <w:r>
+        <w:t xml:space="preserve"> ti dà permesso negato”)</w:t>
       </w:r>
       <w:r>
         <w:sym w:font="Wingdings" w:char="F0E0"/>
       </w:r>
       <w:r>
-        <w:t>format: csv</w:t>
-      </w:r>
-      <w:r>
-        <w:t xml:space="preserve">; encoding: UTF 8; OID: no; Header: yes; delimiter: “;” </w:t>
+        <w:t xml:space="preserve">format: </w:t>
+      </w:r>
+      <w:proofErr w:type="spellStart"/>
+      <w:r>
+        <w:t>csv</w:t>
+      </w:r>
+      <w:proofErr w:type="spellEnd"/>
+      <w:r>
+        <w:t xml:space="preserve">; </w:t>
+      </w:r>
+      <w:proofErr w:type="spellStart"/>
+      <w:r>
+        <w:t>encoding</w:t>
+      </w:r>
+      <w:proofErr w:type="spellEnd"/>
+      <w:r>
+        <w:t xml:space="preserve">: UTF 8; OID: no; </w:t>
+      </w:r>
+      <w:proofErr w:type="spellStart"/>
+      <w:r>
+        <w:t>Header</w:t>
+      </w:r>
+      <w:proofErr w:type="spellEnd"/>
+      <w:r>
+        <w:t xml:space="preserve">: yes; </w:t>
+      </w:r>
+      <w:proofErr w:type="spellStart"/>
+      <w:r>
+        <w:t>delimiter</w:t>
+      </w:r>
+      <w:proofErr w:type="spellEnd"/>
+      <w:r>
+        <w:t xml:space="preserve">: “;” </w:t>
       </w:r>
       <w:r>
         <w:sym w:font="Wingdings" w:char="F0E0"/>
@@ -1624,19 +2327,59 @@
         <w:t>tilizzare la</w:t>
       </w:r>
       <w:r>
-        <w:t xml:space="preserve"> funzione grc_lista_definizioni_</w:t>
-      </w:r>
-      <w:r>
-        <w:t xml:space="preserve">funzioni() </w:t>
-      </w:r>
-      <w:r>
-        <w:t>analogamente a quanto fatto per la funzione “grc_lista_funzioni”. “grc_lista_definizioni_</w:t>
-      </w:r>
-      <w:r>
-        <w:t>funzioni()</w:t>
-      </w:r>
-      <w:r>
-        <w:t>” restituisce in pgAdmin un file di testo con tutte le defnizioni (gli SQL) delle funzioni presenti in un DB</w:t>
+        <w:t xml:space="preserve"> funzione </w:t>
+      </w:r>
+      <w:proofErr w:type="spellStart"/>
+      <w:r>
+        <w:t>grc_lista_definizioni_</w:t>
+      </w:r>
+      <w:r>
+        <w:t>funzioni</w:t>
+      </w:r>
+      <w:proofErr w:type="spellEnd"/>
+      <w:r>
+        <w:t xml:space="preserve">() </w:t>
+      </w:r>
+      <w:r>
+        <w:t>analogamente a quanto fatto per la funzione “</w:t>
+      </w:r>
+      <w:proofErr w:type="spellStart"/>
+      <w:r>
+        <w:t>grc_lista_funzioni</w:t>
+      </w:r>
+      <w:proofErr w:type="spellEnd"/>
+      <w:r>
+        <w:t>”. “</w:t>
+      </w:r>
+      <w:proofErr w:type="spellStart"/>
+      <w:r>
+        <w:t>grc_lista_definizioni_</w:t>
+      </w:r>
+      <w:r>
+        <w:t>funzioni</w:t>
+      </w:r>
+      <w:proofErr w:type="spellEnd"/>
+      <w:r>
+        <w:t>()</w:t>
+      </w:r>
+      <w:r>
+        <w:t xml:space="preserve">” restituisce in </w:t>
+      </w:r>
+      <w:proofErr w:type="spellStart"/>
+      <w:r>
+        <w:t>pgAdmin</w:t>
+      </w:r>
+      <w:proofErr w:type="spellEnd"/>
+      <w:r>
+        <w:t xml:space="preserve"> un file di testo con tutte le </w:t>
+      </w:r>
+      <w:proofErr w:type="spellStart"/>
+      <w:r>
+        <w:t>defnizioni</w:t>
+      </w:r>
+      <w:proofErr w:type="spellEnd"/>
+      <w:r>
+        <w:t xml:space="preserve"> (gli SQL) delle funzioni presenti in un DB</w:t>
       </w:r>
       <w:r>
         <w:t xml:space="preserve">. </w:t>
@@ -1785,13 +2528,45 @@
         <w:t xml:space="preserve">. </w:t>
       </w:r>
       <w:r>
-        <w:t>Per ottenerlo dobbiamo sfruttare la tabella “funzioni_da_importare” definita precedentemente. Copiare da DB2</w:t>
+        <w:t>Per ottenerlo dobbiamo sfruttare la tabella “</w:t>
+      </w:r>
+      <w:proofErr w:type="spellStart"/>
+      <w:r>
+        <w:t>funzioni_da_importare</w:t>
+      </w:r>
+      <w:proofErr w:type="spellEnd"/>
+      <w:r>
+        <w:t>” definita precedentemente. Copiare da DB2</w:t>
       </w:r>
       <w:r>
         <w:t xml:space="preserve"> IN DB3</w:t>
       </w:r>
       <w:r>
-        <w:t xml:space="preserve"> la funzione “grc_lista_definizioni_funzioni_da_importare()”  e la view “grc_lista_funzioni_da_importare”. </w:t>
+        <w:t xml:space="preserve"> la funzione “</w:t>
+      </w:r>
+      <w:proofErr w:type="spellStart"/>
+      <w:r>
+        <w:t>grc_lista_definizioni_funzioni_da_importare</w:t>
+      </w:r>
+      <w:proofErr w:type="spellEnd"/>
+      <w:r>
+        <w:t xml:space="preserve">()”  e la </w:t>
+      </w:r>
+      <w:proofErr w:type="spellStart"/>
+      <w:r>
+        <w:t>view</w:t>
+      </w:r>
+      <w:proofErr w:type="spellEnd"/>
+      <w:r>
+        <w:t xml:space="preserve"> “</w:t>
+      </w:r>
+      <w:proofErr w:type="spellStart"/>
+      <w:r>
+        <w:t>grc_lista_funzioni_da_importare</w:t>
+      </w:r>
+      <w:proofErr w:type="spellEnd"/>
+      <w:r>
+        <w:t xml:space="preserve">”. </w:t>
       </w:r>
       <w:r>
         <w:sym w:font="Wingdings" w:char="F0DF"/>
@@ -1817,10 +2592,26 @@
         <w:ind w:left="360"/>
       </w:pPr>
       <w:r>
-        <w:t>Una volta fatto, runnare da db2 la funzione</w:t>
-      </w:r>
-      <w:r>
-        <w:t xml:space="preserve"> “grc_lista_definizioni_funzioni_da_importare()”  che restituisce l’elenco delle definizioni delle funzioni che sono in DB2 ma non sono in DB3. </w:t>
+        <w:t xml:space="preserve">Una volta fatto, </w:t>
+      </w:r>
+      <w:proofErr w:type="spellStart"/>
+      <w:r>
+        <w:t>runnare</w:t>
+      </w:r>
+      <w:proofErr w:type="spellEnd"/>
+      <w:r>
+        <w:t xml:space="preserve"> da db2 la funzione</w:t>
+      </w:r>
+      <w:r>
+        <w:t xml:space="preserve"> “</w:t>
+      </w:r>
+      <w:proofErr w:type="spellStart"/>
+      <w:r>
+        <w:t>grc_lista_definizioni_funzioni_da_importare</w:t>
+      </w:r>
+      <w:proofErr w:type="spellEnd"/>
+      <w:r>
+        <w:t xml:space="preserve">()”  che restituisce l’elenco delle definizioni delle funzioni che sono in DB2 ma non sono in DB3. </w:t>
       </w:r>
       <w:r>
         <w:rPr>
@@ -1829,7 +2620,15 @@
         <w:t>Copiare tale lista nel capitolo 6 e</w:t>
       </w:r>
       <w:r>
-        <w:t xml:space="preserve"> runnare l’elenco intero in DB3 per aggiungere automaticamente le funzioni in DB3.</w:t>
+        <w:t xml:space="preserve"> </w:t>
+      </w:r>
+      <w:proofErr w:type="spellStart"/>
+      <w:r>
+        <w:t>runnare</w:t>
+      </w:r>
+      <w:proofErr w:type="spellEnd"/>
+      <w:r>
+        <w:t xml:space="preserve"> l’elenco intero in DB3 per aggiungere automaticamente le funzioni in DB3.</w:t>
       </w:r>
     </w:p>
     <w:p>
@@ -1899,19 +2698,75 @@
         <w:t xml:space="preserve">1) </w:t>
       </w:r>
       <w:r>
-        <w:t xml:space="preserve"> "transco</w:t>
+        <w:t xml:space="preserve"> "</w:t>
+      </w:r>
+      <w:proofErr w:type="spellStart"/>
+      <w:r>
+        <w:t>transco</w:t>
       </w:r>
       <w:r>
         <w:t>di</w:t>
       </w:r>
       <w:r>
-        <w:t>fiche_transcodifica"</w:t>
+        <w:t>fiche_transcodifica</w:t>
+      </w:r>
+      <w:proofErr w:type="spellEnd"/>
+      <w:r>
+        <w:t>"</w:t>
       </w:r>
       <w:r>
         <w:t xml:space="preserve"> in quanto non presente in db3 la tabella “transcodifiche”. </w:t>
       </w:r>
       <w:r>
-        <w:t xml:space="preserve">Essa va aggiunta manualmente da DB2 a DB3. Per farlo dobbiamo creare un file excel vuoto da salvare, ad esempio, con il nome “transcodifiche.csv”.Una volta fatto, andare su pgadmin in db2, selezionare la tabella “transcodifiche”, tasto destro, EXPORT, selezionare il file csv appena salvato e utilizzare gli stessi parametri descritti prima (UTF8, header,..). Tale operazione inserisce all’interno del file csv i dati contenuti nella tabella “transcodifiche” del DB2. Copiare l’SQL della tabella “transcodifiche” da DB2 e incollarlo sul query editor di DB3 per creare la tabella vuota “transcodifiche”. A questo punto fare tasto destro, IMPORT </w:t>
+        <w:t xml:space="preserve">Essa va aggiunta manualmente da DB2 a DB3. Per farlo dobbiamo creare un file </w:t>
+      </w:r>
+      <w:proofErr w:type="spellStart"/>
+      <w:r>
+        <w:t>excel</w:t>
+      </w:r>
+      <w:proofErr w:type="spellEnd"/>
+      <w:r>
+        <w:t xml:space="preserve"> vuoto da salvare, ad esempio, con il nome “transcodifiche.</w:t>
+      </w:r>
+      <w:proofErr w:type="spellStart"/>
+      <w:r>
+        <w:t>csv</w:t>
+      </w:r>
+      <w:proofErr w:type="spellEnd"/>
+      <w:r>
+        <w:t xml:space="preserve">”.Una volta fatto, andare su </w:t>
+      </w:r>
+      <w:proofErr w:type="spellStart"/>
+      <w:r>
+        <w:t>pgadmin</w:t>
+      </w:r>
+      <w:proofErr w:type="spellEnd"/>
+      <w:r>
+        <w:t xml:space="preserve"> in db2, selezionare la tabella “transcodifiche”, tasto destro, EXPORT, selezionare il file </w:t>
+      </w:r>
+      <w:proofErr w:type="spellStart"/>
+      <w:r>
+        <w:t>csv</w:t>
+      </w:r>
+      <w:proofErr w:type="spellEnd"/>
+      <w:r>
+        <w:t xml:space="preserve"> appena salvato e utilizzare gli stessi parametri descritti prima (UTF8, </w:t>
+      </w:r>
+      <w:proofErr w:type="spellStart"/>
+      <w:r>
+        <w:t>header</w:t>
+      </w:r>
+      <w:proofErr w:type="spellEnd"/>
+      <w:r>
+        <w:t xml:space="preserve">,..). Tale operazione inserisce all’interno del file </w:t>
+      </w:r>
+      <w:proofErr w:type="spellStart"/>
+      <w:r>
+        <w:t>csv</w:t>
+      </w:r>
+      <w:proofErr w:type="spellEnd"/>
+      <w:r>
+        <w:t xml:space="preserve"> i dati contenuti nella tabella “transcodifiche” del DB2. Copiare l’SQL della tabella “transcodifiche” da DB2 e incollarlo sul query editor di DB3 per creare la tabella vuota “transcodifiche”. A questo punto fare tasto destro, IMPORT </w:t>
       </w:r>
       <w:r>
         <w:sym w:font="Wingdings" w:char="F0E0"/>
@@ -1920,7 +2775,15 @@
         <w:t xml:space="preserve"> file name : “transcodifiche.csv”</w:t>
       </w:r>
       <w:r>
-        <w:t xml:space="preserve"> con i soliti parametri. Questo procedimento permette il trasferiment delle funzioni di transcodifica. </w:t>
+        <w:t xml:space="preserve"> con i soliti parametri. Questo procedimento permette il </w:t>
+      </w:r>
+      <w:proofErr w:type="spellStart"/>
+      <w:r>
+        <w:t>trasferiment</w:t>
+      </w:r>
+      <w:proofErr w:type="spellEnd"/>
+      <w:r>
+        <w:t xml:space="preserve"> delle funzioni di transcodifica. </w:t>
       </w:r>
     </w:p>
     <w:p>
@@ -1944,7 +2807,15 @@
         </w:numPr>
       </w:pPr>
       <w:r>
-        <w:t>1) anagrafiche_id_cod_cognome : motivo sconosciuto</w:t>
+        <w:t xml:space="preserve">1) </w:t>
+      </w:r>
+      <w:proofErr w:type="spellStart"/>
+      <w:r>
+        <w:t>anagrafiche_id_cod_cognome</w:t>
+      </w:r>
+      <w:proofErr w:type="spellEnd"/>
+      <w:r>
+        <w:t xml:space="preserve"> : motivo sconosciuto</w:t>
       </w:r>
     </w:p>
     <w:p>
@@ -1956,7 +2827,31 @@
         </w:numPr>
       </w:pPr>
       <w:r>
-        <w:t>2) grc_accoda_trattamenti_dati : questo perché DB2 ha 3 funzioni con lo stesso nome “grc_accoda_trattamenti_dati” e DB3 ne ha 1. La funzione cerca.vert non segnala il fatto che DB2 ne ha tre e DB3 una, trova semplicemente la corrispondenza e non segnala nulla. Per tal motivo le 2 funzioni mancanti vanno aggiunte a mano.</w:t>
+        <w:t xml:space="preserve">2) </w:t>
+      </w:r>
+      <w:proofErr w:type="spellStart"/>
+      <w:r>
+        <w:t>grc_accoda_trattamenti_dati</w:t>
+      </w:r>
+      <w:proofErr w:type="spellEnd"/>
+      <w:r>
+        <w:t xml:space="preserve"> : questo perché DB2 ha 3 funzioni con lo stesso nome “</w:t>
+      </w:r>
+      <w:proofErr w:type="spellStart"/>
+      <w:r>
+        <w:t>grc_accoda_trattamenti_dati</w:t>
+      </w:r>
+      <w:proofErr w:type="spellEnd"/>
+      <w:r>
+        <w:t xml:space="preserve">” e DB3 ne ha 1. La funzione </w:t>
+      </w:r>
+      <w:proofErr w:type="spellStart"/>
+      <w:r>
+        <w:t>cerca.vert</w:t>
+      </w:r>
+      <w:proofErr w:type="spellEnd"/>
+      <w:r>
+        <w:t xml:space="preserve"> non segnala il fatto che DB2 ne ha tre e DB3 una, trova semplicemente la corrispondenza e non segnala nulla. Per tal motivo le 2 funzioni mancanti vanno aggiunte a mano.</w:t>
       </w:r>
     </w:p>
     <w:p>
@@ -1968,7 +2863,15 @@
         </w:numPr>
       </w:pPr>
       <w:r>
-        <w:t xml:space="preserve">3)grc_accodamentoperrischioperativi : stesso motivo spiegato sopra </w:t>
+        <w:t>3)</w:t>
+      </w:r>
+      <w:proofErr w:type="spellStart"/>
+      <w:r>
+        <w:t>grc_accodamentoperrischioperativi</w:t>
+      </w:r>
+      <w:proofErr w:type="spellEnd"/>
+      <w:r>
+        <w:t xml:space="preserve"> : stesso motivo spiegato sopra </w:t>
       </w:r>
       <w:r>
         <w:sym w:font="Wingdings" w:char="F0E0"/>
@@ -2060,7 +2963,29 @@
           <w:sz w:val="24"/>
           <w:szCs w:val="24"/>
         </w:rPr>
-        <w:t xml:space="preserve"> ma utilizzando solo l’excel!</w:t>
+        <w:t xml:space="preserve"> ma utilizzando solo </w:t>
+      </w:r>
+      <w:proofErr w:type="spellStart"/>
+      <w:r>
+        <w:rPr>
+          <w:b/>
+          <w:bCs/>
+          <w:color w:val="FF0000"/>
+          <w:sz w:val="24"/>
+          <w:szCs w:val="24"/>
+        </w:rPr>
+        <w:t>l’excel</w:t>
+      </w:r>
+      <w:proofErr w:type="spellEnd"/>
+      <w:r>
+        <w:rPr>
+          <w:b/>
+          <w:bCs/>
+          <w:color w:val="FF0000"/>
+          <w:sz w:val="24"/>
+          <w:szCs w:val="24"/>
+        </w:rPr>
+        <w:t>!</w:t>
       </w:r>
     </w:p>
     <w:p>
@@ -2084,8 +3009,17 @@
           <w:sz w:val="24"/>
           <w:szCs w:val="24"/>
         </w:rPr>
-        <w:t>: all’interno della cartella condivisa “fuse-angular</w:t>
-      </w:r>
+        <w:t>: all’interno della cartella condivisa “fuse-</w:t>
+      </w:r>
+      <w:proofErr w:type="spellStart"/>
+      <w:r>
+        <w:rPr>
+          <w:sz w:val="24"/>
+          <w:szCs w:val="24"/>
+        </w:rPr>
+        <w:t>angular</w:t>
+      </w:r>
+      <w:proofErr w:type="spellEnd"/>
       <w:r>
         <w:rPr>
           <w:sz w:val="24"/>
@@ -2100,6 +3034,7 @@
         </w:rPr>
         <w:sym w:font="Wingdings" w:char="F0E0"/>
       </w:r>
+      <w:proofErr w:type="spellStart"/>
       <w:r>
         <w:rPr>
           <w:sz w:val="24"/>
@@ -2107,6 +3042,7 @@
         </w:rPr>
         <w:t>docs</w:t>
       </w:r>
+      <w:proofErr w:type="spellEnd"/>
       <w:r>
         <w:rPr>
           <w:sz w:val="24"/>
@@ -2114,6 +3050,7 @@
         </w:rPr>
         <w:sym w:font="Wingdings" w:char="F0E0"/>
       </w:r>
+      <w:proofErr w:type="spellStart"/>
       <w:r>
         <w:rPr>
           <w:sz w:val="24"/>
@@ -2121,6 +3058,7 @@
         </w:rPr>
         <w:t>ProceduraDiMigrazione</w:t>
       </w:r>
+      <w:proofErr w:type="spellEnd"/>
     </w:p>
     <w:p/>
     <w:p/>
@@ -2163,22 +3101,102 @@
           <w:sz w:val="24"/>
           <w:szCs w:val="24"/>
         </w:rPr>
-        <w:t>Le view sono meno problematiche. Nella prova eseguita i giorni 03-03-2020 e 05-03-2020, le view da trasferire da DB2 a DB3 sono state in totale 16. Ho optato quindi per un procedimento “manuale” di copia-incollaggio che è durato 5 minuti. In un’altra situazione, dove il copia-incollaggio dovesse risultare troppo oneroso, si può certamente eseguire una procedura analoga a quella descritta per il trasferimento delle funzioni.</w:t>
-      </w:r>
-    </w:p>
-    <w:p>
-      <w:pPr>
-        <w:rPr>
-          <w:sz w:val="24"/>
-          <w:szCs w:val="24"/>
-        </w:rPr>
-      </w:pPr>
-      <w:r>
-        <w:rPr>
-          <w:sz w:val="24"/>
-          <w:szCs w:val="24"/>
-        </w:rPr>
-        <w:t xml:space="preserve">Effettivamente è stato eseguito un approccio identico a quello usato per le funzioni per definire le liste delle view di DB2 e di DB3. Il confronto tra le due liste può essere fatto tranquillamente a mano mettendo in ordine alfabetico le 2 liste e annotando le view che sono in DB2 e che non sono in DB3 oppure tramite la solita funzione cerca.vert. </w:t>
+        <w:t xml:space="preserve">Le </w:t>
+      </w:r>
+      <w:proofErr w:type="spellStart"/>
+      <w:r>
+        <w:rPr>
+          <w:sz w:val="24"/>
+          <w:szCs w:val="24"/>
+        </w:rPr>
+        <w:t>view</w:t>
+      </w:r>
+      <w:proofErr w:type="spellEnd"/>
+      <w:r>
+        <w:rPr>
+          <w:sz w:val="24"/>
+          <w:szCs w:val="24"/>
+        </w:rPr>
+        <w:t xml:space="preserve"> sono meno problematiche. Nella prova eseguita i giorni 03-03-2020 e 05-03-2020, le </w:t>
+      </w:r>
+      <w:proofErr w:type="spellStart"/>
+      <w:r>
+        <w:rPr>
+          <w:sz w:val="24"/>
+          <w:szCs w:val="24"/>
+        </w:rPr>
+        <w:t>view</w:t>
+      </w:r>
+      <w:proofErr w:type="spellEnd"/>
+      <w:r>
+        <w:rPr>
+          <w:sz w:val="24"/>
+          <w:szCs w:val="24"/>
+        </w:rPr>
+        <w:t xml:space="preserve"> da trasferire da DB2 a DB3 sono state in totale 16. Ho optato quindi per un procedimento “manuale” di copia-incollaggio che è durato 5 minuti. In un’altra situazione, dove il copia-incollaggio dovesse risultare troppo oneroso, si può certamente eseguire una procedura analoga a quella descritta per il trasferimento delle funzioni.</w:t>
+      </w:r>
+    </w:p>
+    <w:p>
+      <w:pPr>
+        <w:rPr>
+          <w:sz w:val="24"/>
+          <w:szCs w:val="24"/>
+        </w:rPr>
+      </w:pPr>
+      <w:r>
+        <w:rPr>
+          <w:sz w:val="24"/>
+          <w:szCs w:val="24"/>
+        </w:rPr>
+        <w:t xml:space="preserve">Effettivamente è stato eseguito un approccio identico a quello usato per le funzioni per definire le liste delle </w:t>
+      </w:r>
+      <w:proofErr w:type="spellStart"/>
+      <w:r>
+        <w:rPr>
+          <w:sz w:val="24"/>
+          <w:szCs w:val="24"/>
+        </w:rPr>
+        <w:t>view</w:t>
+      </w:r>
+      <w:proofErr w:type="spellEnd"/>
+      <w:r>
+        <w:rPr>
+          <w:sz w:val="24"/>
+          <w:szCs w:val="24"/>
+        </w:rPr>
+        <w:t xml:space="preserve"> di DB2 e di DB3. Il confronto tra le due liste può essere fatto tranquillamente a mano mettendo in ordine alfabetico le 2 liste e annotando le </w:t>
+      </w:r>
+      <w:proofErr w:type="spellStart"/>
+      <w:r>
+        <w:rPr>
+          <w:sz w:val="24"/>
+          <w:szCs w:val="24"/>
+        </w:rPr>
+        <w:t>view</w:t>
+      </w:r>
+      <w:proofErr w:type="spellEnd"/>
+      <w:r>
+        <w:rPr>
+          <w:sz w:val="24"/>
+          <w:szCs w:val="24"/>
+        </w:rPr>
+        <w:t xml:space="preserve"> che sono in DB2 e che non sono in DB3 oppure tramite la solita funzione </w:t>
+      </w:r>
+      <w:proofErr w:type="spellStart"/>
+      <w:r>
+        <w:rPr>
+          <w:sz w:val="24"/>
+          <w:szCs w:val="24"/>
+        </w:rPr>
+        <w:t>cerca.vert</w:t>
+      </w:r>
+      <w:proofErr w:type="spellEnd"/>
+      <w:r>
+        <w:rPr>
+          <w:sz w:val="24"/>
+          <w:szCs w:val="24"/>
+        </w:rPr>
+        <w:t xml:space="preserve">. </w:t>
       </w:r>
     </w:p>
     <w:p>
@@ -2195,7 +3213,25 @@
           <w:sz w:val="24"/>
           <w:szCs w:val="24"/>
         </w:rPr>
-        <w:t>Nel file word precedentemente definito sono stati definiti quindi i seguenti capitoli relativi alle view:</w:t>
+        <w:t xml:space="preserve">Nel file word precedentemente definito sono stati definiti quindi i seguenti capitoli relativi alle </w:t>
+      </w:r>
+      <w:proofErr w:type="spellStart"/>
+      <w:r>
+        <w:rPr>
+          <w:strike/>
+          <w:sz w:val="24"/>
+          <w:szCs w:val="24"/>
+        </w:rPr>
+        <w:t>view</w:t>
+      </w:r>
+      <w:proofErr w:type="spellEnd"/>
+      <w:r>
+        <w:rPr>
+          <w:strike/>
+          <w:sz w:val="24"/>
+          <w:szCs w:val="24"/>
+        </w:rPr>
+        <w:t>:</w:t>
       </w:r>
     </w:p>
     <w:p>
@@ -2384,7 +3420,39 @@
           <w:sz w:val="24"/>
           <w:szCs w:val="24"/>
         </w:rPr>
-        <w:t>Il procedimento di aggiunta delle view in DB3, nel caso delle view, è stato</w:t>
+        <w:t xml:space="preserve">Il procedimento di aggiunta delle </w:t>
+      </w:r>
+      <w:proofErr w:type="spellStart"/>
+      <w:r>
+        <w:rPr>
+          <w:sz w:val="24"/>
+          <w:szCs w:val="24"/>
+        </w:rPr>
+        <w:t>view</w:t>
+      </w:r>
+      <w:proofErr w:type="spellEnd"/>
+      <w:r>
+        <w:rPr>
+          <w:sz w:val="24"/>
+          <w:szCs w:val="24"/>
+        </w:rPr>
+        <w:t xml:space="preserve"> in DB3, nel caso delle </w:t>
+      </w:r>
+      <w:proofErr w:type="spellStart"/>
+      <w:r>
+        <w:rPr>
+          <w:sz w:val="24"/>
+          <w:szCs w:val="24"/>
+        </w:rPr>
+        <w:t>view</w:t>
+      </w:r>
+      <w:proofErr w:type="spellEnd"/>
+      <w:r>
+        <w:rPr>
+          <w:sz w:val="24"/>
+          <w:szCs w:val="24"/>
+        </w:rPr>
+        <w:t>, è stato</w:t>
       </w:r>
       <w:r>
         <w:rPr>
@@ -2398,7 +3466,23 @@
           <w:sz w:val="24"/>
           <w:szCs w:val="24"/>
         </w:rPr>
-        <w:t xml:space="preserve"> eseguito a mano direttamente su pgAdmin </w:t>
+        <w:t xml:space="preserve"> eseguito a mano direttamente su </w:t>
+      </w:r>
+      <w:proofErr w:type="spellStart"/>
+      <w:r>
+        <w:rPr>
+          <w:sz w:val="24"/>
+          <w:szCs w:val="24"/>
+        </w:rPr>
+        <w:t>pgAdmin</w:t>
+      </w:r>
+      <w:proofErr w:type="spellEnd"/>
+      <w:r>
+        <w:rPr>
+          <w:sz w:val="24"/>
+          <w:szCs w:val="24"/>
+        </w:rPr>
+        <w:t xml:space="preserve"> </w:t>
       </w:r>
     </w:p>
     <w:p/>
@@ -2439,7 +3523,15 @@
         </w:numPr>
       </w:pPr>
       <w:r>
-        <w:t>Esportare in csv record da DB1 riferiti all’azienda da migrare;</w:t>
+        <w:t xml:space="preserve">Esportare in </w:t>
+      </w:r>
+      <w:proofErr w:type="spellStart"/>
+      <w:r>
+        <w:t>csv</w:t>
+      </w:r>
+      <w:proofErr w:type="spellEnd"/>
+      <w:r>
+        <w:t xml:space="preserve"> record da DB1 riferiti all’azienda da migrare;</w:t>
       </w:r>
     </w:p>
     <w:p>
@@ -2451,7 +3543,15 @@
         </w:numPr>
       </w:pPr>
       <w:r>
-        <w:t>Importare dai file csv creati tramite la fase 1 gli eventuali files.</w:t>
+        <w:t xml:space="preserve">Importare dai file </w:t>
+      </w:r>
+      <w:proofErr w:type="spellStart"/>
+      <w:r>
+        <w:t>csv</w:t>
+      </w:r>
+      <w:proofErr w:type="spellEnd"/>
+      <w:r>
+        <w:t xml:space="preserve"> creati tramite la fase 1 gli eventuali files.</w:t>
       </w:r>
     </w:p>
     <w:p>
@@ -2477,7 +3577,35 @@
         <w:rPr>
           <w:b/>
         </w:rPr>
-        <w:t>Esportare in csv i recorda da DB1</w:t>
+        <w:t xml:space="preserve">Esportare in </w:t>
+      </w:r>
+      <w:proofErr w:type="spellStart"/>
+      <w:r>
+        <w:rPr>
+          <w:b/>
+        </w:rPr>
+        <w:t>csv</w:t>
+      </w:r>
+      <w:proofErr w:type="spellEnd"/>
+      <w:r>
+        <w:rPr>
+          <w:b/>
+        </w:rPr>
+        <w:t xml:space="preserve"> i </w:t>
+      </w:r>
+      <w:proofErr w:type="spellStart"/>
+      <w:r>
+        <w:rPr>
+          <w:b/>
+        </w:rPr>
+        <w:t>recorda</w:t>
+      </w:r>
+      <w:proofErr w:type="spellEnd"/>
+      <w:r>
+        <w:rPr>
+          <w:b/>
+        </w:rPr>
+        <w:t xml:space="preserve"> da DB1</w:t>
       </w:r>
     </w:p>
     <w:p>
@@ -2513,7 +3641,23 @@
           <w:sz w:val="24"/>
           <w:szCs w:val="24"/>
         </w:rPr>
-        <w:t>la funzione grc_esporta_tabelle(‘codice azienda’, ‘codice partizione’).</w:t>
+        <w:t xml:space="preserve">la funzione </w:t>
+      </w:r>
+      <w:proofErr w:type="spellStart"/>
+      <w:r>
+        <w:rPr>
+          <w:sz w:val="24"/>
+          <w:szCs w:val="24"/>
+        </w:rPr>
+        <w:t>grc_esporta_tabelle</w:t>
+      </w:r>
+      <w:proofErr w:type="spellEnd"/>
+      <w:r>
+        <w:rPr>
+          <w:sz w:val="24"/>
+          <w:szCs w:val="24"/>
+        </w:rPr>
+        <w:t>(‘codice azienda’, ‘codice partizione’).</w:t>
       </w:r>
     </w:p>
     <w:p>
@@ -2578,7 +3722,21 @@
         <w:rPr>
           <w:b/>
         </w:rPr>
-        <w:t>tare record dai file csv creati tramite fase 1</w:t>
+        <w:t xml:space="preserve">tare record dai file </w:t>
+      </w:r>
+      <w:proofErr w:type="spellStart"/>
+      <w:r>
+        <w:rPr>
+          <w:b/>
+        </w:rPr>
+        <w:t>csv</w:t>
+      </w:r>
+      <w:proofErr w:type="spellEnd"/>
+      <w:r>
+        <w:rPr>
+          <w:b/>
+        </w:rPr>
+        <w:t xml:space="preserve"> creati tramite fase 1</w:t>
       </w:r>
       <w:r>
         <w:rPr>
@@ -2620,14 +3778,177 @@
           <w:sz w:val="24"/>
           <w:szCs w:val="24"/>
         </w:rPr>
-        <w:t>un formato csv in un database si utilizza la funzione grc_importa_tabelle(‘nome azienda’).</w:t>
-      </w:r>
-      <w:r>
-        <w:rPr>
-          <w:sz w:val="24"/>
-          <w:szCs w:val="24"/>
-        </w:rPr>
-        <w:t xml:space="preserve"> Si precisa che la funziona grc_importa_tabelle include al suo interno una routine che cancella preventivamente i record relativi alla Società da importare.</w:t>
+        <w:t xml:space="preserve">un formato </w:t>
+      </w:r>
+      <w:proofErr w:type="spellStart"/>
+      <w:r>
+        <w:rPr>
+          <w:sz w:val="24"/>
+          <w:szCs w:val="24"/>
+        </w:rPr>
+        <w:t>csv</w:t>
+      </w:r>
+      <w:proofErr w:type="spellEnd"/>
+      <w:r>
+        <w:rPr>
+          <w:sz w:val="24"/>
+          <w:szCs w:val="24"/>
+        </w:rPr>
+        <w:t xml:space="preserve"> in un database si utilizza la funzione </w:t>
+      </w:r>
+      <w:proofErr w:type="spellStart"/>
+      <w:r>
+        <w:rPr>
+          <w:sz w:val="24"/>
+          <w:szCs w:val="24"/>
+        </w:rPr>
+        <w:t>grc_importa_tabelle</w:t>
+      </w:r>
+      <w:proofErr w:type="spellEnd"/>
+      <w:r>
+        <w:rPr>
+          <w:sz w:val="24"/>
+          <w:szCs w:val="24"/>
+        </w:rPr>
+        <w:t>(‘nome azienda’).</w:t>
+      </w:r>
+      <w:r>
+        <w:rPr>
+          <w:sz w:val="24"/>
+          <w:szCs w:val="24"/>
+        </w:rPr>
+        <w:t xml:space="preserve"> Si precisa che la funziona </w:t>
+      </w:r>
+      <w:proofErr w:type="spellStart"/>
+      <w:r>
+        <w:rPr>
+          <w:sz w:val="24"/>
+          <w:szCs w:val="24"/>
+        </w:rPr>
+        <w:t>grc_importa_tabelle</w:t>
+      </w:r>
+      <w:proofErr w:type="spellEnd"/>
+      <w:r>
+        <w:rPr>
+          <w:sz w:val="24"/>
+          <w:szCs w:val="24"/>
+        </w:rPr>
+        <w:t xml:space="preserve"> include al suo interno una routine che cancella preventivamente i record relativi alla Società da importare.</w:t>
+      </w:r>
+    </w:p>
+    <w:p>
+      <w:pPr>
+        <w:pStyle w:val="Paragrafoelenco"/>
+        <w:numPr>
+          <w:ilvl w:val="6"/>
+          <w:numId w:val="2"/>
+        </w:numPr>
+        <w:rPr>
+          <w:b/>
+        </w:rPr>
+      </w:pPr>
+      <w:r>
+        <w:rPr>
+          <w:b/>
+        </w:rPr>
+        <w:t xml:space="preserve">Aggiornare le </w:t>
+      </w:r>
+      <w:proofErr w:type="spellStart"/>
+      <w:r>
+        <w:rPr>
+          <w:b/>
+        </w:rPr>
+        <w:t>angrafiche</w:t>
+      </w:r>
+      <w:proofErr w:type="spellEnd"/>
+      <w:r>
+        <w:rPr>
+          <w:b/>
+        </w:rPr>
+        <w:t xml:space="preserve"> con seguente query</w:t>
+      </w:r>
+      <w:r>
+        <w:rPr>
+          <w:b/>
+        </w:rPr>
+        <w:t>:</w:t>
+      </w:r>
+    </w:p>
+    <w:p>
+      <w:r>
+        <w:t xml:space="preserve">update </w:t>
+      </w:r>
+      <w:proofErr w:type="spellStart"/>
+      <w:r>
+        <w:t>entrasp.anagrafiche_vr</w:t>
+      </w:r>
+      <w:proofErr w:type="spellEnd"/>
+      <w:r>
+        <w:t xml:space="preserve"> </w:t>
+      </w:r>
+      <w:proofErr w:type="spellStart"/>
+      <w:r>
+        <w:t>vr</w:t>
+      </w:r>
+      <w:proofErr w:type="spellEnd"/>
+      <w:r>
+        <w:t xml:space="preserve"> set denominazione=coalesce(vr.ragione_sociale,'')||coalesce(an.nome,'')||' '||</w:t>
+      </w:r>
+      <w:proofErr w:type="spellStart"/>
+      <w:r>
+        <w:t>coalesce</w:t>
+      </w:r>
+      <w:proofErr w:type="spellEnd"/>
+      <w:r>
+        <w:t>(</w:t>
+      </w:r>
+      <w:proofErr w:type="spellStart"/>
+      <w:r>
+        <w:t>an.cognome</w:t>
+      </w:r>
+      <w:proofErr w:type="spellEnd"/>
+      <w:r>
+        <w:t xml:space="preserve">,'') from </w:t>
+      </w:r>
+      <w:proofErr w:type="spellStart"/>
+      <w:r>
+        <w:t>entrasp.anagrafiche_id</w:t>
+      </w:r>
+      <w:proofErr w:type="spellEnd"/>
+      <w:r>
+        <w:t xml:space="preserve"> an WHERE  </w:t>
+      </w:r>
+      <w:proofErr w:type="spellStart"/>
+      <w:r>
+        <w:t>an.codice_part</w:t>
+      </w:r>
+      <w:proofErr w:type="spellEnd"/>
+      <w:r>
+        <w:t>=</w:t>
+      </w:r>
+      <w:proofErr w:type="spellStart"/>
+      <w:r>
+        <w:t>vr.codice_part</w:t>
+      </w:r>
+      <w:proofErr w:type="spellEnd"/>
+      <w:r>
+        <w:t xml:space="preserve"> and </w:t>
+      </w:r>
+      <w:proofErr w:type="spellStart"/>
+      <w:r>
+        <w:t>an.id_anagrafica</w:t>
+      </w:r>
+      <w:proofErr w:type="spellEnd"/>
+      <w:r>
+        <w:t>=</w:t>
+      </w:r>
+      <w:proofErr w:type="spellStart"/>
+      <w:r>
+        <w:t>vr.id_anagrafica</w:t>
+      </w:r>
+      <w:proofErr w:type="spellEnd"/>
+      <w:r>
+        <w:t xml:space="preserve">  </w:t>
       </w:r>
     </w:p>
     <w:p/>
@@ -2669,7 +3990,25 @@
           <w:szCs w:val="24"/>
           <w:highlight w:val="yellow"/>
         </w:rPr>
-        <w:t xml:space="preserve">Di seguito le tabelle, sequenze, view, funzioni preliminari per </w:t>
+        <w:t xml:space="preserve">Di seguito le tabelle, sequenze, </w:t>
+      </w:r>
+      <w:proofErr w:type="spellStart"/>
+      <w:r>
+        <w:rPr>
+          <w:sz w:val="24"/>
+          <w:szCs w:val="24"/>
+          <w:highlight w:val="yellow"/>
+        </w:rPr>
+        <w:t>view</w:t>
+      </w:r>
+      <w:proofErr w:type="spellEnd"/>
+      <w:r>
+        <w:rPr>
+          <w:sz w:val="24"/>
+          <w:szCs w:val="24"/>
+          <w:highlight w:val="yellow"/>
+        </w:rPr>
+        <w:t xml:space="preserve">, funzioni preliminari per </w:t>
       </w:r>
       <w:r>
         <w:rPr>
@@ -2903,6 +4242,7 @@
               <w:rPr>
                 <w:highlight w:val="yellow"/>
               </w:rPr>
+              <w:lastRenderedPageBreak/>
               <w:t>Tabelle</w:t>
             </w:r>
           </w:p>
@@ -2955,11 +4295,19 @@
                 <w:highlight w:val="yellow"/>
               </w:rPr>
             </w:pPr>
+            <w:proofErr w:type="spellStart"/>
             <w:r>
               <w:rPr>
                 <w:highlight w:val="yellow"/>
               </w:rPr>
-              <w:t>grc_tabella_ca_cp_nulla(text)</w:t>
+              <w:t>grc_tabella_ca_cp_nulla</w:t>
+            </w:r>
+            <w:proofErr w:type="spellEnd"/>
+            <w:r>
+              <w:rPr>
+                <w:highlight w:val="yellow"/>
+              </w:rPr>
+              <w:t>(text)</w:t>
             </w:r>
           </w:p>
         </w:tc>
@@ -3011,12 +4359,14 @@
                 <w:highlight w:val="yellow"/>
               </w:rPr>
             </w:pPr>
+            <w:proofErr w:type="spellStart"/>
             <w:r>
               <w:rPr>
                 <w:highlight w:val="yellow"/>
               </w:rPr>
               <w:t>entrasp.grc_esporta_tabelle</w:t>
             </w:r>
+            <w:proofErr w:type="spellEnd"/>
           </w:p>
         </w:tc>
         <w:tc>
@@ -3067,13 +4417,14 @@
                 <w:highlight w:val="yellow"/>
               </w:rPr>
             </w:pPr>
+            <w:proofErr w:type="spellStart"/>
             <w:r>
               <w:rPr>
                 <w:highlight w:val="yellow"/>
               </w:rPr>
-              <w:lastRenderedPageBreak/>
               <w:t>grc_importa_tabelle</w:t>
             </w:r>
+            <w:proofErr w:type="spellEnd"/>
           </w:p>
         </w:tc>
         <w:tc>
@@ -3124,12 +4475,14 @@
                 <w:highlight w:val="yellow"/>
               </w:rPr>
             </w:pPr>
+            <w:proofErr w:type="spellStart"/>
             <w:r>
               <w:rPr>
                 <w:highlight w:val="yellow"/>
               </w:rPr>
               <w:t>entrasp.grc_listacampiditabella</w:t>
             </w:r>
+            <w:proofErr w:type="spellEnd"/>
           </w:p>
         </w:tc>
         <w:tc>
@@ -3180,12 +4533,14 @@
                 <w:highlight w:val="yellow"/>
               </w:rPr>
             </w:pPr>
+            <w:proofErr w:type="spellStart"/>
             <w:r>
               <w:rPr>
                 <w:highlight w:val="yellow"/>
               </w:rPr>
               <w:t>entrasp.grc_listacampiditabella_non_pk</w:t>
             </w:r>
+            <w:proofErr w:type="spellEnd"/>
           </w:p>
         </w:tc>
         <w:tc>
@@ -3236,12 +4591,14 @@
                 <w:highlight w:val="yellow"/>
               </w:rPr>
             </w:pPr>
+            <w:proofErr w:type="spellStart"/>
             <w:r>
               <w:rPr>
                 <w:highlight w:val="yellow"/>
               </w:rPr>
               <w:t>entrasp.grc_listacampiditabella_pk</w:t>
             </w:r>
+            <w:proofErr w:type="spellEnd"/>
           </w:p>
         </w:tc>
         <w:tc>
@@ -3292,12 +4649,14 @@
                 <w:highlight w:val="yellow"/>
               </w:rPr>
             </w:pPr>
+            <w:proofErr w:type="spellStart"/>
             <w:r>
               <w:rPr>
                 <w:highlight w:val="yellow"/>
               </w:rPr>
               <w:t>grc_tabelle</w:t>
             </w:r>
+            <w:proofErr w:type="spellEnd"/>
           </w:p>
         </w:tc>
         <w:tc>
@@ -3310,12 +4669,14 @@
                 <w:highlight w:val="yellow"/>
               </w:rPr>
             </w:pPr>
+            <w:proofErr w:type="spellStart"/>
             <w:r>
               <w:rPr>
                 <w:highlight w:val="yellow"/>
               </w:rPr>
               <w:t>View</w:t>
             </w:r>
+            <w:proofErr w:type="spellEnd"/>
           </w:p>
         </w:tc>
         <w:tc>
@@ -3348,12 +4709,14 @@
                 <w:highlight w:val="yellow"/>
               </w:rPr>
             </w:pPr>
+            <w:proofErr w:type="spellStart"/>
             <w:r>
               <w:rPr>
                 <w:highlight w:val="yellow"/>
               </w:rPr>
               <w:t>grc_tabelle_ca_cp</w:t>
             </w:r>
+            <w:proofErr w:type="spellEnd"/>
           </w:p>
         </w:tc>
         <w:tc>
@@ -3366,12 +4729,14 @@
                 <w:highlight w:val="yellow"/>
               </w:rPr>
             </w:pPr>
+            <w:proofErr w:type="spellStart"/>
             <w:r>
               <w:rPr>
                 <w:highlight w:val="yellow"/>
               </w:rPr>
               <w:t>View</w:t>
             </w:r>
+            <w:proofErr w:type="spellEnd"/>
           </w:p>
         </w:tc>
         <w:tc>
@@ -3415,7 +4780,61 @@
           <w:szCs w:val="24"/>
           <w:highlight w:val="yellow"/>
         </w:rPr>
-        <w:t>[FATTO DA SILVIO].Le view, tabelle e la sequenza (credo sia la sequenza s10, non la sequenza s01) sono state aggiunte. E’ stato comunque fatto un file word “seq_tab_fun_view” contenente tutti gli SQL necessari ad aggiungere tali sequenze, tabelle, funzioni e view per backup e comodità futura (almeno credo) con all’interno le istruzioni necessarie all’importazione.</w:t>
+        <w:t xml:space="preserve">[FATTO DA SILVIO].Le </w:t>
+      </w:r>
+      <w:proofErr w:type="spellStart"/>
+      <w:r>
+        <w:rPr>
+          <w:sz w:val="24"/>
+          <w:szCs w:val="24"/>
+          <w:highlight w:val="yellow"/>
+        </w:rPr>
+        <w:t>view</w:t>
+      </w:r>
+      <w:proofErr w:type="spellEnd"/>
+      <w:r>
+        <w:rPr>
+          <w:sz w:val="24"/>
+          <w:szCs w:val="24"/>
+          <w:highlight w:val="yellow"/>
+        </w:rPr>
+        <w:t>, tabelle e la sequenza (credo sia la sequenza s10, non la sequenza s01) sono state aggiunte. E’ stato comunque fatto un file word “</w:t>
+      </w:r>
+      <w:proofErr w:type="spellStart"/>
+      <w:r>
+        <w:rPr>
+          <w:sz w:val="24"/>
+          <w:szCs w:val="24"/>
+          <w:highlight w:val="yellow"/>
+        </w:rPr>
+        <w:t>seq_tab_fun_view</w:t>
+      </w:r>
+      <w:proofErr w:type="spellEnd"/>
+      <w:r>
+        <w:rPr>
+          <w:sz w:val="24"/>
+          <w:szCs w:val="24"/>
+          <w:highlight w:val="yellow"/>
+        </w:rPr>
+        <w:t xml:space="preserve">” contenente tutti gli SQL necessari ad aggiungere tali sequenze, tabelle, funzioni e </w:t>
+      </w:r>
+      <w:proofErr w:type="spellStart"/>
+      <w:r>
+        <w:rPr>
+          <w:sz w:val="24"/>
+          <w:szCs w:val="24"/>
+          <w:highlight w:val="yellow"/>
+        </w:rPr>
+        <w:t>view</w:t>
+      </w:r>
+      <w:proofErr w:type="spellEnd"/>
+      <w:r>
+        <w:rPr>
+          <w:sz w:val="24"/>
+          <w:szCs w:val="24"/>
+          <w:highlight w:val="yellow"/>
+        </w:rPr>
+        <w:t xml:space="preserve"> per backup e comodità futura (almeno credo) con all’interno le istruzioni necessarie all’importazione.</w:t>
       </w:r>
     </w:p>
     <w:p>
@@ -3463,7 +4882,25 @@
           <w:szCs w:val="24"/>
           <w:highlight w:val="red"/>
         </w:rPr>
-        <w:t xml:space="preserve"> … forse con l’ultimo lavoro di aver scaricato i constraint non serve</w:t>
+        <w:t xml:space="preserve"> … forse con l’ultimo lavoro di aver scaricato i </w:t>
+      </w:r>
+      <w:proofErr w:type="spellStart"/>
+      <w:r>
+        <w:rPr>
+          <w:sz w:val="24"/>
+          <w:szCs w:val="24"/>
+          <w:highlight w:val="red"/>
+        </w:rPr>
+        <w:t>constraint</w:t>
+      </w:r>
+      <w:proofErr w:type="spellEnd"/>
+      <w:r>
+        <w:rPr>
+          <w:sz w:val="24"/>
+          <w:szCs w:val="24"/>
+          <w:highlight w:val="red"/>
+        </w:rPr>
+        <w:t xml:space="preserve"> non serve</w:t>
       </w:r>
     </w:p>
     <w:p>
@@ -3495,32 +4932,150 @@
     </w:p>
     <w:p>
       <w:pPr>
-        <w:rPr>
-          <w:sz w:val="24"/>
-          <w:szCs w:val="24"/>
-        </w:rPr>
-      </w:pPr>
-      <w:r>
-        <w:rPr>
-          <w:sz w:val="24"/>
-          <w:szCs w:val="24"/>
-        </w:rPr>
-        <w:t>ALTER TABLE entrasp.progetti_fasi DROP COLUMN id_versione_ultima cascade;</w:t>
-      </w:r>
-    </w:p>
-    <w:p>
-      <w:pPr>
-        <w:rPr>
-          <w:sz w:val="24"/>
-          <w:szCs w:val="24"/>
-        </w:rPr>
-      </w:pPr>
-      <w:r>
-        <w:rPr>
-          <w:sz w:val="24"/>
-          <w:szCs w:val="24"/>
-        </w:rPr>
-        <w:t>ALTER TABLE entrasp.progetti DROP COLUMN id_versione_ultima;</w:t>
+        <w:pStyle w:val="Paragrafoelenco"/>
+        <w:numPr>
+          <w:ilvl w:val="0"/>
+          <w:numId w:val="19"/>
+        </w:numPr>
+      </w:pPr>
+      <w:r>
+        <w:t xml:space="preserve">ALTER TABLE </w:t>
+      </w:r>
+      <w:proofErr w:type="spellStart"/>
+      <w:r>
+        <w:t>entrasp.progetti_fasi</w:t>
+      </w:r>
+      <w:proofErr w:type="spellEnd"/>
+      <w:r>
+        <w:t xml:space="preserve"> DROP COLUMN </w:t>
+      </w:r>
+      <w:proofErr w:type="spellStart"/>
+      <w:r>
+        <w:t>id_versione_ultima</w:t>
+      </w:r>
+      <w:proofErr w:type="spellEnd"/>
+      <w:r>
+        <w:t xml:space="preserve"> </w:t>
+      </w:r>
+      <w:proofErr w:type="spellStart"/>
+      <w:r>
+        <w:t>cascade</w:t>
+      </w:r>
+      <w:proofErr w:type="spellEnd"/>
+      <w:r>
+        <w:t>;</w:t>
+      </w:r>
+    </w:p>
+    <w:p>
+      <w:pPr>
+        <w:pStyle w:val="Paragrafoelenco"/>
+        <w:numPr>
+          <w:ilvl w:val="0"/>
+          <w:numId w:val="19"/>
+        </w:numPr>
+      </w:pPr>
+      <w:r>
+        <w:t xml:space="preserve">ALTER TABLE </w:t>
+      </w:r>
+      <w:proofErr w:type="spellStart"/>
+      <w:r>
+        <w:t>entrasp.progetti</w:t>
+      </w:r>
+      <w:proofErr w:type="spellEnd"/>
+      <w:r>
+        <w:t xml:space="preserve"> DROP COLUMN </w:t>
+      </w:r>
+      <w:proofErr w:type="spellStart"/>
+      <w:r>
+        <w:t>id_versione_ultima</w:t>
+      </w:r>
+      <w:proofErr w:type="spellEnd"/>
+      <w:r>
+        <w:t>;</w:t>
+      </w:r>
+    </w:p>
+    <w:p>
+      <w:pPr>
+        <w:pStyle w:val="Paragrafoelenco"/>
+        <w:numPr>
+          <w:ilvl w:val="0"/>
+          <w:numId w:val="19"/>
+        </w:numPr>
+      </w:pPr>
+      <w:r>
+        <w:t xml:space="preserve">update </w:t>
+      </w:r>
+      <w:proofErr w:type="spellStart"/>
+      <w:r>
+        <w:t>entrasp.anagrafiche_vr</w:t>
+      </w:r>
+      <w:proofErr w:type="spellEnd"/>
+      <w:r>
+        <w:t xml:space="preserve"> </w:t>
+      </w:r>
+      <w:proofErr w:type="spellStart"/>
+      <w:r>
+        <w:t>vr</w:t>
+      </w:r>
+      <w:proofErr w:type="spellEnd"/>
+      <w:r>
+        <w:t xml:space="preserve"> set denominazione=coalesce(vr.ragione_sociale,'')||coalesce(an.nome,'')||' '||</w:t>
+      </w:r>
+      <w:proofErr w:type="spellStart"/>
+      <w:r>
+        <w:t>coalesce</w:t>
+      </w:r>
+      <w:proofErr w:type="spellEnd"/>
+      <w:r>
+        <w:t>(</w:t>
+      </w:r>
+      <w:proofErr w:type="spellStart"/>
+      <w:r>
+        <w:t>an.cognome</w:t>
+      </w:r>
+      <w:proofErr w:type="spellEnd"/>
+      <w:r>
+        <w:t xml:space="preserve">,'') from </w:t>
+      </w:r>
+      <w:proofErr w:type="spellStart"/>
+      <w:r>
+        <w:t>entrasp.anagrafiche_id</w:t>
+      </w:r>
+      <w:proofErr w:type="spellEnd"/>
+      <w:r>
+        <w:t xml:space="preserve"> an WHERE  </w:t>
+      </w:r>
+      <w:proofErr w:type="spellStart"/>
+      <w:r>
+        <w:t>an.codice_part</w:t>
+      </w:r>
+      <w:proofErr w:type="spellEnd"/>
+      <w:r>
+        <w:t>=</w:t>
+      </w:r>
+      <w:proofErr w:type="spellStart"/>
+      <w:r>
+        <w:t>vr.codice_part</w:t>
+      </w:r>
+      <w:proofErr w:type="spellEnd"/>
+      <w:r>
+        <w:t xml:space="preserve"> and </w:t>
+      </w:r>
+      <w:proofErr w:type="spellStart"/>
+      <w:r>
+        <w:t>an.id_anagrafica</w:t>
+      </w:r>
+      <w:proofErr w:type="spellEnd"/>
+      <w:r>
+        <w:t>=</w:t>
+      </w:r>
+      <w:proofErr w:type="spellStart"/>
+      <w:r>
+        <w:t>vr.id_anagrafica</w:t>
+      </w:r>
+      <w:proofErr w:type="spellEnd"/>
+      <w:r>
+        <w:t xml:space="preserve">  </w:t>
       </w:r>
     </w:p>
     <w:p>
@@ -3721,6 +5276,95 @@
     </w:lvl>
   </w:abstractNum>
   <w:abstractNum w:abstractNumId="2" w15:restartNumberingAfterBreak="0">
+    <w:nsid w:val="0C1B2C95"/>
+    <w:multiLevelType w:val="hybridMultilevel"/>
+    <w:tmpl w:val="27704A54"/>
+    <w:lvl w:ilvl="0" w:tplc="0410000F">
+      <w:start w:val="1"/>
+      <w:numFmt w:val="decimal"/>
+      <w:lvlText w:val="%1."/>
+      <w:lvlJc w:val="left"/>
+      <w:pPr>
+        <w:ind w:left="720" w:hanging="360"/>
+      </w:pPr>
+      <w:rPr>
+        <w:rFonts w:hint="default"/>
+      </w:rPr>
+    </w:lvl>
+    <w:lvl w:ilvl="1" w:tplc="04100019" w:tentative="1">
+      <w:start w:val="1"/>
+      <w:numFmt w:val="lowerLetter"/>
+      <w:lvlText w:val="%2."/>
+      <w:lvlJc w:val="left"/>
+      <w:pPr>
+        <w:ind w:left="1440" w:hanging="360"/>
+      </w:pPr>
+    </w:lvl>
+    <w:lvl w:ilvl="2" w:tplc="0410001B" w:tentative="1">
+      <w:start w:val="1"/>
+      <w:numFmt w:val="lowerRoman"/>
+      <w:lvlText w:val="%3."/>
+      <w:lvlJc w:val="right"/>
+      <w:pPr>
+        <w:ind w:left="2160" w:hanging="180"/>
+      </w:pPr>
+    </w:lvl>
+    <w:lvl w:ilvl="3" w:tplc="0410000F" w:tentative="1">
+      <w:start w:val="1"/>
+      <w:numFmt w:val="decimal"/>
+      <w:lvlText w:val="%4."/>
+      <w:lvlJc w:val="left"/>
+      <w:pPr>
+        <w:ind w:left="2880" w:hanging="360"/>
+      </w:pPr>
+    </w:lvl>
+    <w:lvl w:ilvl="4" w:tplc="04100019" w:tentative="1">
+      <w:start w:val="1"/>
+      <w:numFmt w:val="lowerLetter"/>
+      <w:lvlText w:val="%5."/>
+      <w:lvlJc w:val="left"/>
+      <w:pPr>
+        <w:ind w:left="3600" w:hanging="360"/>
+      </w:pPr>
+    </w:lvl>
+    <w:lvl w:ilvl="5" w:tplc="0410001B" w:tentative="1">
+      <w:start w:val="1"/>
+      <w:numFmt w:val="lowerRoman"/>
+      <w:lvlText w:val="%6."/>
+      <w:lvlJc w:val="right"/>
+      <w:pPr>
+        <w:ind w:left="4320" w:hanging="180"/>
+      </w:pPr>
+    </w:lvl>
+    <w:lvl w:ilvl="6" w:tplc="0410000F" w:tentative="1">
+      <w:start w:val="1"/>
+      <w:numFmt w:val="decimal"/>
+      <w:lvlText w:val="%7."/>
+      <w:lvlJc w:val="left"/>
+      <w:pPr>
+        <w:ind w:left="5040" w:hanging="360"/>
+      </w:pPr>
+    </w:lvl>
+    <w:lvl w:ilvl="7" w:tplc="04100019" w:tentative="1">
+      <w:start w:val="1"/>
+      <w:numFmt w:val="lowerLetter"/>
+      <w:lvlText w:val="%8."/>
+      <w:lvlJc w:val="left"/>
+      <w:pPr>
+        <w:ind w:left="5760" w:hanging="360"/>
+      </w:pPr>
+    </w:lvl>
+    <w:lvl w:ilvl="8" w:tplc="0410001B" w:tentative="1">
+      <w:start w:val="1"/>
+      <w:numFmt w:val="lowerRoman"/>
+      <w:lvlText w:val="%9."/>
+      <w:lvlJc w:val="right"/>
+      <w:pPr>
+        <w:ind w:left="6480" w:hanging="180"/>
+      </w:pPr>
+    </w:lvl>
+  </w:abstractNum>
+  <w:abstractNum w:abstractNumId="3" w15:restartNumberingAfterBreak="0">
     <w:nsid w:val="142174B1"/>
     <w:multiLevelType w:val="hybridMultilevel"/>
     <w:tmpl w:val="F2289B64"/>
@@ -3833,7 +5477,7 @@
       </w:rPr>
     </w:lvl>
   </w:abstractNum>
-  <w:abstractNum w:abstractNumId="3" w15:restartNumberingAfterBreak="0">
+  <w:abstractNum w:abstractNumId="4" w15:restartNumberingAfterBreak="0">
     <w:nsid w:val="1C622289"/>
     <w:multiLevelType w:val="hybridMultilevel"/>
     <w:tmpl w:val="BF20E17C"/>
@@ -3922,7 +5566,7 @@
       </w:pPr>
     </w:lvl>
   </w:abstractNum>
-  <w:abstractNum w:abstractNumId="4" w15:restartNumberingAfterBreak="0">
+  <w:abstractNum w:abstractNumId="5" w15:restartNumberingAfterBreak="0">
     <w:nsid w:val="1E722DBE"/>
     <w:multiLevelType w:val="hybridMultilevel"/>
     <w:tmpl w:val="BF20E17C"/>
@@ -4011,7 +5655,7 @@
       </w:pPr>
     </w:lvl>
   </w:abstractNum>
-  <w:abstractNum w:abstractNumId="5" w15:restartNumberingAfterBreak="0">
+  <w:abstractNum w:abstractNumId="6" w15:restartNumberingAfterBreak="0">
     <w:nsid w:val="1F8B45AA"/>
     <w:multiLevelType w:val="hybridMultilevel"/>
     <w:tmpl w:val="ACF0F5EC"/>
@@ -4101,7 +5745,7 @@
       </w:pPr>
     </w:lvl>
   </w:abstractNum>
-  <w:abstractNum w:abstractNumId="6" w15:restartNumberingAfterBreak="0">
+  <w:abstractNum w:abstractNumId="7" w15:restartNumberingAfterBreak="0">
     <w:nsid w:val="2BF16D3F"/>
     <w:multiLevelType w:val="hybridMultilevel"/>
     <w:tmpl w:val="C04839C8"/>
@@ -4214,7 +5858,7 @@
       </w:rPr>
     </w:lvl>
   </w:abstractNum>
-  <w:abstractNum w:abstractNumId="7" w15:restartNumberingAfterBreak="0">
+  <w:abstractNum w:abstractNumId="8" w15:restartNumberingAfterBreak="0">
     <w:nsid w:val="323A055F"/>
     <w:multiLevelType w:val="hybridMultilevel"/>
     <w:tmpl w:val="9ECA5AB2"/>
@@ -4300,7 +5944,7 @@
       </w:pPr>
     </w:lvl>
   </w:abstractNum>
-  <w:abstractNum w:abstractNumId="8" w15:restartNumberingAfterBreak="0">
+  <w:abstractNum w:abstractNumId="9" w15:restartNumberingAfterBreak="0">
     <w:nsid w:val="3BE90EE2"/>
     <w:multiLevelType w:val="multilevel"/>
     <w:tmpl w:val="0410001D"/>
@@ -4386,7 +6030,7 @@
       </w:pPr>
     </w:lvl>
   </w:abstractNum>
-  <w:abstractNum w:abstractNumId="9" w15:restartNumberingAfterBreak="0">
+  <w:abstractNum w:abstractNumId="10" w15:restartNumberingAfterBreak="0">
     <w:nsid w:val="433F031C"/>
     <w:multiLevelType w:val="hybridMultilevel"/>
     <w:tmpl w:val="BF20E17C"/>
@@ -4475,7 +6119,7 @@
       </w:pPr>
     </w:lvl>
   </w:abstractNum>
-  <w:abstractNum w:abstractNumId="10" w15:restartNumberingAfterBreak="0">
+  <w:abstractNum w:abstractNumId="11" w15:restartNumberingAfterBreak="0">
     <w:nsid w:val="4C7D1DED"/>
     <w:multiLevelType w:val="hybridMultilevel"/>
     <w:tmpl w:val="EA160F56"/>
@@ -4561,7 +6205,7 @@
       </w:pPr>
     </w:lvl>
   </w:abstractNum>
-  <w:abstractNum w:abstractNumId="11" w15:restartNumberingAfterBreak="0">
+  <w:abstractNum w:abstractNumId="12" w15:restartNumberingAfterBreak="0">
     <w:nsid w:val="50FA547B"/>
     <w:multiLevelType w:val="hybridMultilevel"/>
     <w:tmpl w:val="58D42BAC"/>
@@ -4674,7 +6318,7 @@
       </w:rPr>
     </w:lvl>
   </w:abstractNum>
-  <w:abstractNum w:abstractNumId="12" w15:restartNumberingAfterBreak="0">
+  <w:abstractNum w:abstractNumId="13" w15:restartNumberingAfterBreak="0">
     <w:nsid w:val="529F546E"/>
     <w:multiLevelType w:val="multilevel"/>
     <w:tmpl w:val="4DE01D96"/>
@@ -4760,7 +6404,7 @@
       </w:pPr>
     </w:lvl>
   </w:abstractNum>
-  <w:abstractNum w:abstractNumId="13" w15:restartNumberingAfterBreak="0">
+  <w:abstractNum w:abstractNumId="14" w15:restartNumberingAfterBreak="0">
     <w:nsid w:val="645557FE"/>
     <w:multiLevelType w:val="hybridMultilevel"/>
     <w:tmpl w:val="E6D87776"/>
@@ -4846,7 +6490,93 @@
       </w:pPr>
     </w:lvl>
   </w:abstractNum>
-  <w:abstractNum w:abstractNumId="14" w15:restartNumberingAfterBreak="0">
+  <w:abstractNum w:abstractNumId="15" w15:restartNumberingAfterBreak="0">
+    <w:nsid w:val="67503FC1"/>
+    <w:multiLevelType w:val="multilevel"/>
+    <w:tmpl w:val="4DE01D96"/>
+    <w:lvl w:ilvl="0">
+      <w:start w:val="1"/>
+      <w:numFmt w:val="decimal"/>
+      <w:lvlText w:val="%1)"/>
+      <w:lvlJc w:val="left"/>
+      <w:pPr>
+        <w:ind w:left="360" w:hanging="360"/>
+      </w:pPr>
+    </w:lvl>
+    <w:lvl w:ilvl="1">
+      <w:start w:val="1"/>
+      <w:numFmt w:val="lowerLetter"/>
+      <w:lvlText w:val="%2)"/>
+      <w:lvlJc w:val="left"/>
+      <w:pPr>
+        <w:ind w:left="720" w:hanging="360"/>
+      </w:pPr>
+    </w:lvl>
+    <w:lvl w:ilvl="2">
+      <w:start w:val="1"/>
+      <w:numFmt w:val="lowerRoman"/>
+      <w:lvlText w:val="%3)"/>
+      <w:lvlJc w:val="left"/>
+      <w:pPr>
+        <w:ind w:left="1080" w:hanging="360"/>
+      </w:pPr>
+    </w:lvl>
+    <w:lvl w:ilvl="3">
+      <w:start w:val="1"/>
+      <w:numFmt w:val="decimal"/>
+      <w:lvlText w:val="(%4)"/>
+      <w:lvlJc w:val="left"/>
+      <w:pPr>
+        <w:ind w:left="1440" w:hanging="360"/>
+      </w:pPr>
+    </w:lvl>
+    <w:lvl w:ilvl="4">
+      <w:start w:val="1"/>
+      <w:numFmt w:val="lowerLetter"/>
+      <w:lvlText w:val="(%5)"/>
+      <w:lvlJc w:val="left"/>
+      <w:pPr>
+        <w:ind w:left="1800" w:hanging="360"/>
+      </w:pPr>
+    </w:lvl>
+    <w:lvl w:ilvl="5">
+      <w:start w:val="1"/>
+      <w:numFmt w:val="lowerRoman"/>
+      <w:lvlText w:val="(%6)"/>
+      <w:lvlJc w:val="left"/>
+      <w:pPr>
+        <w:ind w:left="2160" w:hanging="360"/>
+      </w:pPr>
+    </w:lvl>
+    <w:lvl w:ilvl="6">
+      <w:start w:val="1"/>
+      <w:numFmt w:val="decimal"/>
+      <w:lvlText w:val="%7."/>
+      <w:lvlJc w:val="left"/>
+      <w:pPr>
+        <w:ind w:left="2520" w:hanging="360"/>
+      </w:pPr>
+    </w:lvl>
+    <w:lvl w:ilvl="7">
+      <w:start w:val="1"/>
+      <w:numFmt w:val="lowerLetter"/>
+      <w:lvlText w:val="%8."/>
+      <w:lvlJc w:val="left"/>
+      <w:pPr>
+        <w:ind w:left="2880" w:hanging="360"/>
+      </w:pPr>
+    </w:lvl>
+    <w:lvl w:ilvl="8">
+      <w:start w:val="1"/>
+      <w:numFmt w:val="lowerRoman"/>
+      <w:lvlText w:val="%9."/>
+      <w:lvlJc w:val="left"/>
+      <w:pPr>
+        <w:ind w:left="3240" w:hanging="360"/>
+      </w:pPr>
+    </w:lvl>
+  </w:abstractNum>
+  <w:abstractNum w:abstractNumId="16" w15:restartNumberingAfterBreak="0">
     <w:nsid w:val="69CB694F"/>
     <w:multiLevelType w:val="hybridMultilevel"/>
     <w:tmpl w:val="48624CE6"/>
@@ -4935,7 +6665,7 @@
       </w:pPr>
     </w:lvl>
   </w:abstractNum>
-  <w:abstractNum w:abstractNumId="15" w15:restartNumberingAfterBreak="0">
+  <w:abstractNum w:abstractNumId="17" w15:restartNumberingAfterBreak="0">
     <w:nsid w:val="761C520F"/>
     <w:multiLevelType w:val="hybridMultilevel"/>
     <w:tmpl w:val="7B804DAC"/>
@@ -5021,7 +6751,7 @@
       </w:pPr>
     </w:lvl>
   </w:abstractNum>
-  <w:abstractNum w:abstractNumId="16" w15:restartNumberingAfterBreak="0">
+  <w:abstractNum w:abstractNumId="18" w15:restartNumberingAfterBreak="0">
     <w:nsid w:val="773F6BBB"/>
     <w:multiLevelType w:val="hybridMultilevel"/>
     <w:tmpl w:val="ABCAFBE6"/>
@@ -5137,52 +6867,58 @@
     <w:abstractNumId w:val="1"/>
   </w:num>
   <w:num w:numId="2">
+    <w:abstractNumId w:val="13"/>
+  </w:num>
+  <w:num w:numId="3">
+    <w:abstractNumId w:val="7"/>
+  </w:num>
+  <w:num w:numId="4">
     <w:abstractNumId w:val="12"/>
   </w:num>
-  <w:num w:numId="3">
-    <w:abstractNumId w:val="6"/>
-  </w:num>
-  <w:num w:numId="4">
-    <w:abstractNumId w:val="11"/>
-  </w:num>
   <w:num w:numId="5">
-    <w:abstractNumId w:val="2"/>
+    <w:abstractNumId w:val="3"/>
   </w:num>
   <w:num w:numId="6">
-    <w:abstractNumId w:val="9"/>
+    <w:abstractNumId w:val="10"/>
   </w:num>
   <w:num w:numId="7">
-    <w:abstractNumId w:val="3"/>
+    <w:abstractNumId w:val="4"/>
   </w:num>
   <w:num w:numId="8">
-    <w:abstractNumId w:val="15"/>
+    <w:abstractNumId w:val="17"/>
   </w:num>
   <w:num w:numId="9">
-    <w:abstractNumId w:val="8"/>
+    <w:abstractNumId w:val="9"/>
   </w:num>
   <w:num w:numId="10">
     <w:abstractNumId w:val="0"/>
   </w:num>
   <w:num w:numId="11">
-    <w:abstractNumId w:val="13"/>
+    <w:abstractNumId w:val="14"/>
   </w:num>
   <w:num w:numId="12">
-    <w:abstractNumId w:val="10"/>
+    <w:abstractNumId w:val="11"/>
   </w:num>
   <w:num w:numId="13">
-    <w:abstractNumId w:val="14"/>
+    <w:abstractNumId w:val="16"/>
   </w:num>
   <w:num w:numId="14">
-    <w:abstractNumId w:val="16"/>
+    <w:abstractNumId w:val="18"/>
   </w:num>
   <w:num w:numId="15">
+    <w:abstractNumId w:val="6"/>
+  </w:num>
+  <w:num w:numId="16">
+    <w:abstractNumId w:val="8"/>
+  </w:num>
+  <w:num w:numId="17">
     <w:abstractNumId w:val="5"/>
   </w:num>
-  <w:num w:numId="16">
-    <w:abstractNumId w:val="7"/>
+  <w:num w:numId="18">
+    <w:abstractNumId w:val="15"/>
   </w:num>
-  <w:num w:numId="17">
-    <w:abstractNumId w:val="4"/>
+  <w:num w:numId="19">
+    <w:abstractNumId w:val="2"/>
   </w:num>
 </w:numbering>
 </file>

</xml_diff>